<commit_message>
openmp demo update report , and makefile
</commit_message>
<xml_diff>
--- a/ParallelProcessing_Report_Draft_codex.docx
+++ b/ParallelProcessing_Report_Draft_codex.docx
@@ -384,6 +384,13 @@
     </w:p>
     <w:sdt>
       <w:sdtPr>
+        <w:rPr>
+          <w:rFonts w:ascii="Calibri" w:eastAsiaTheme="minorEastAsia" w:hAnsi="Calibri" w:cs="Calibri"/>
+          <w:color w:val="auto"/>
+          <w:kern w:val="2"/>
+          <w:sz w:val="22"/>
+          <w:szCs w:val="22"/>
+        </w:rPr>
         <w:id w:val="-170342886"/>
         <w:docPartObj>
           <w:docPartGallery w:val="Table of Contents"/>
@@ -392,14 +399,9 @@
       </w:sdtPr>
       <w:sdtEndPr>
         <w:rPr>
-          <w:rFonts w:ascii="Calibri" w:eastAsiaTheme="minorEastAsia" w:hAnsi="Calibri" w:cs="Calibri"/>
           <w:b/>
           <w:bCs/>
           <w:noProof/>
-          <w:color w:val="auto"/>
-          <w:kern w:val="2"/>
-          <w:sz w:val="22"/>
-          <w:szCs w:val="22"/>
         </w:rPr>
       </w:sdtEndPr>
       <w:sdtContent>
@@ -439,7 +441,7 @@
           <w:r>
             <w:fldChar w:fldCharType="separate"/>
           </w:r>
-          <w:hyperlink w:anchor="_Toc230193500" w:history="1">
+          <w:hyperlink w:anchor="_Toc230201356" w:history="1">
             <w:r>
               <w:rPr>
                 <w:rStyle w:val="Hyperlink"/>
@@ -467,7 +469,7 @@
                 <w:noProof/>
                 <w:webHidden/>
               </w:rPr>
-              <w:instrText xml:space="preserve"> PAGEREF _Toc230193500 \h </w:instrText>
+              <w:instrText xml:space="preserve"> PAGEREF _Toc230201356 \h </w:instrText>
             </w:r>
             <w:r>
               <w:rPr>
@@ -487,7 +489,7 @@
                 <w:noProof/>
                 <w:webHidden/>
               </w:rPr>
-              <w:t>3</w:t>
+              <w:t>2</w:t>
             </w:r>
             <w:r>
               <w:rPr>
@@ -511,7 +513,7 @@
               <w:szCs w:val="24"/>
             </w:rPr>
           </w:pPr>
-          <w:hyperlink w:anchor="_Toc230193501" w:history="1">
+          <w:hyperlink w:anchor="_Toc230201357" w:history="1">
             <w:r>
               <w:rPr>
                 <w:rStyle w:val="Hyperlink"/>
@@ -554,7 +556,7 @@
                 <w:noProof/>
                 <w:webHidden/>
               </w:rPr>
-              <w:instrText xml:space="preserve"> PAGEREF _Toc230193501 \h </w:instrText>
+              <w:instrText xml:space="preserve"> PAGEREF _Toc230201357 \h </w:instrText>
             </w:r>
             <w:r>
               <w:rPr>
@@ -598,7 +600,7 @@
               <w:szCs w:val="24"/>
             </w:rPr>
           </w:pPr>
-          <w:hyperlink w:anchor="_Toc230193502" w:history="1">
+          <w:hyperlink w:anchor="_Toc230201358" w:history="1">
             <w:r>
               <w:rPr>
                 <w:rStyle w:val="Hyperlink"/>
@@ -640,7 +642,7 @@
                 <w:noProof/>
                 <w:webHidden/>
               </w:rPr>
-              <w:instrText xml:space="preserve"> PAGEREF _Toc230193502 \h </w:instrText>
+              <w:instrText xml:space="preserve"> PAGEREF _Toc230201358 \h </w:instrText>
             </w:r>
             <w:r>
               <w:rPr>
@@ -684,7 +686,7 @@
               <w:szCs w:val="24"/>
             </w:rPr>
           </w:pPr>
-          <w:hyperlink w:anchor="_Toc230193503" w:history="1">
+          <w:hyperlink w:anchor="_Toc230201359" w:history="1">
             <w:r>
               <w:rPr>
                 <w:rStyle w:val="Hyperlink"/>
@@ -711,7 +713,7 @@
                 <w:noProof/>
                 <w:webHidden/>
               </w:rPr>
-              <w:instrText xml:space="preserve"> PAGEREF _Toc230193503 \h </w:instrText>
+              <w:instrText xml:space="preserve"> PAGEREF _Toc230201359 \h </w:instrText>
             </w:r>
             <w:r>
               <w:rPr>
@@ -755,7 +757,7 @@
               <w:szCs w:val="24"/>
             </w:rPr>
           </w:pPr>
-          <w:hyperlink w:anchor="_Toc230193504" w:history="1">
+          <w:hyperlink w:anchor="_Toc230201360" w:history="1">
             <w:r>
               <w:rPr>
                 <w:rStyle w:val="Hyperlink"/>
@@ -783,7 +785,7 @@
                 <w:noProof/>
                 <w:webHidden/>
               </w:rPr>
-              <w:instrText xml:space="preserve"> PAGEREF _Toc230193504 \h </w:instrText>
+              <w:instrText xml:space="preserve"> PAGEREF _Toc230201360 \h </w:instrText>
             </w:r>
             <w:r>
               <w:rPr>
@@ -827,7 +829,7 @@
               <w:szCs w:val="24"/>
             </w:rPr>
           </w:pPr>
-          <w:hyperlink w:anchor="_Toc230193505" w:history="1">
+          <w:hyperlink w:anchor="_Toc230201361" w:history="1">
             <w:r>
               <w:rPr>
                 <w:rStyle w:val="Hyperlink"/>
@@ -870,7 +872,7 @@
                 <w:noProof/>
                 <w:webHidden/>
               </w:rPr>
-              <w:instrText xml:space="preserve"> PAGEREF _Toc230193505 \h </w:instrText>
+              <w:instrText xml:space="preserve"> PAGEREF _Toc230201361 \h </w:instrText>
             </w:r>
             <w:r>
               <w:rPr>
@@ -914,21 +916,21 @@
               <w:szCs w:val="24"/>
             </w:rPr>
           </w:pPr>
-          <w:hyperlink w:anchor="_Toc230193506" w:history="1">
+          <w:hyperlink w:anchor="_Toc230201362" w:history="1">
             <w:r>
               <w:rPr>
                 <w:rStyle w:val="Hyperlink"/>
                 <w:noProof/>
+              </w:rPr>
+              <w:t xml:space="preserve">OpenMP </w:t>
+            </w:r>
+            <w:r>
+              <w:rPr>
+                <w:rStyle w:val="Hyperlink"/>
+                <w:noProof/>
                 <w:lang w:val="el-GR"/>
               </w:rPr>
-              <w:t xml:space="preserve">Τμήματα που έγιναν </w:t>
-            </w:r>
-            <w:r>
-              <w:rPr>
-                <w:rStyle w:val="Hyperlink"/>
-                <w:noProof/>
-              </w:rPr>
-              <w:t>vectorized</w:t>
+              <w:t>υλοποίηση</w:t>
             </w:r>
             <w:r>
               <w:rPr>
@@ -949,7 +951,7 @@
                 <w:noProof/>
                 <w:webHidden/>
               </w:rPr>
-              <w:instrText xml:space="preserve"> PAGEREF _Toc230193506 \h </w:instrText>
+              <w:instrText xml:space="preserve"> PAGEREF _Toc230201362 \h </w:instrText>
             </w:r>
             <w:r>
               <w:rPr>
@@ -969,7 +971,7 @@
                 <w:noProof/>
                 <w:webHidden/>
               </w:rPr>
-              <w:t>5</w:t>
+              <w:t>6</w:t>
             </w:r>
             <w:r>
               <w:rPr>
@@ -993,36 +995,21 @@
               <w:szCs w:val="24"/>
             </w:rPr>
           </w:pPr>
-          <w:hyperlink w:anchor="_Toc230193507" w:history="1">
+          <w:hyperlink w:anchor="_Toc230201363" w:history="1">
             <w:r>
               <w:rPr>
                 <w:rStyle w:val="Hyperlink"/>
                 <w:noProof/>
+              </w:rPr>
+              <w:t xml:space="preserve">MPI </w:t>
+            </w:r>
+            <w:r>
+              <w:rPr>
+                <w:rStyle w:val="Hyperlink"/>
+                <w:noProof/>
                 <w:lang w:val="el-GR"/>
               </w:rPr>
-              <w:t xml:space="preserve">Βελτιστοποιήσεις μνήμης και </w:t>
-            </w:r>
-            <w:r>
-              <w:rPr>
-                <w:rStyle w:val="Hyperlink"/>
-                <w:noProof/>
-              </w:rPr>
-              <w:t>I</w:t>
-            </w:r>
-            <w:r>
-              <w:rPr>
-                <w:rStyle w:val="Hyperlink"/>
-                <w:noProof/>
-                <w:lang w:val="el-GR"/>
-              </w:rPr>
-              <w:t>/</w:t>
-            </w:r>
-            <w:r>
-              <w:rPr>
-                <w:rStyle w:val="Hyperlink"/>
-                <w:noProof/>
-              </w:rPr>
-              <w:t>O</w:t>
+              <w:t>υλοποίηση</w:t>
             </w:r>
             <w:r>
               <w:rPr>
@@ -1043,7 +1030,7 @@
                 <w:noProof/>
                 <w:webHidden/>
               </w:rPr>
-              <w:instrText xml:space="preserve"> PAGEREF _Toc230193507 \h </w:instrText>
+              <w:instrText xml:space="preserve"> PAGEREF _Toc230201363 \h </w:instrText>
             </w:r>
             <w:r>
               <w:rPr>
@@ -1063,7 +1050,7 @@
                 <w:noProof/>
                 <w:webHidden/>
               </w:rPr>
-              <w:t>5</w:t>
+              <w:t>6</w:t>
             </w:r>
             <w:r>
               <w:rPr>
@@ -1087,13 +1074,21 @@
               <w:szCs w:val="24"/>
             </w:rPr>
           </w:pPr>
-          <w:hyperlink w:anchor="_Toc230193508" w:history="1">
+          <w:hyperlink w:anchor="_Toc230201364" w:history="1">
             <w:r>
               <w:rPr>
                 <w:rStyle w:val="Hyperlink"/>
                 <w:noProof/>
               </w:rPr>
-              <w:t>Compiler flags</w:t>
+              <w:t xml:space="preserve">CUDA </w:t>
+            </w:r>
+            <w:r>
+              <w:rPr>
+                <w:rStyle w:val="Hyperlink"/>
+                <w:noProof/>
+                <w:lang w:val="el-GR"/>
+              </w:rPr>
+              <w:t>υλοποίηση</w:t>
             </w:r>
             <w:r>
               <w:rPr>
@@ -1114,7 +1109,7 @@
                 <w:noProof/>
                 <w:webHidden/>
               </w:rPr>
-              <w:instrText xml:space="preserve"> PAGEREF _Toc230193508 \h </w:instrText>
+              <w:instrText xml:space="preserve"> PAGEREF _Toc230201364 \h </w:instrText>
             </w:r>
             <w:r>
               <w:rPr>
@@ -1135,6 +1130,150 @@
                 <w:webHidden/>
               </w:rPr>
               <w:t>6</w:t>
+            </w:r>
+            <w:r>
+              <w:rPr>
+                <w:noProof/>
+                <w:webHidden/>
+              </w:rPr>
+              <w:fldChar w:fldCharType="end"/>
+            </w:r>
+          </w:hyperlink>
+        </w:p>
+        <w:p>
+          <w:pPr>
+            <w:pStyle w:val="TOC1"/>
+            <w:tabs>
+              <w:tab w:val="right" w:leader="dot" w:pos="9016"/>
+            </w:tabs>
+            <w:rPr>
+              <w:rFonts w:asciiTheme="minorHAnsi" w:hAnsiTheme="minorHAnsi" w:cstheme="minorBidi"/>
+              <w:noProof/>
+              <w:sz w:val="24"/>
+              <w:szCs w:val="24"/>
+            </w:rPr>
+          </w:pPr>
+          <w:hyperlink w:anchor="_Toc230201365" w:history="1">
+            <w:r>
+              <w:rPr>
+                <w:rStyle w:val="Hyperlink"/>
+                <w:noProof/>
+                <w:lang w:val="el-GR"/>
+              </w:rPr>
+              <w:t>7. Έλεγχος ορθότητας</w:t>
+            </w:r>
+            <w:r>
+              <w:rPr>
+                <w:noProof/>
+                <w:webHidden/>
+              </w:rPr>
+              <w:tab/>
+            </w:r>
+            <w:r>
+              <w:rPr>
+                <w:noProof/>
+                <w:webHidden/>
+              </w:rPr>
+              <w:fldChar w:fldCharType="begin"/>
+            </w:r>
+            <w:r>
+              <w:rPr>
+                <w:noProof/>
+                <w:webHidden/>
+              </w:rPr>
+              <w:instrText xml:space="preserve"> PAGEREF _Toc230201365 \h </w:instrText>
+            </w:r>
+            <w:r>
+              <w:rPr>
+                <w:noProof/>
+                <w:webHidden/>
+              </w:rPr>
+            </w:r>
+            <w:r>
+              <w:rPr>
+                <w:noProof/>
+                <w:webHidden/>
+              </w:rPr>
+              <w:fldChar w:fldCharType="separate"/>
+            </w:r>
+            <w:r>
+              <w:rPr>
+                <w:noProof/>
+                <w:webHidden/>
+              </w:rPr>
+              <w:t>7</w:t>
+            </w:r>
+            <w:r>
+              <w:rPr>
+                <w:noProof/>
+                <w:webHidden/>
+              </w:rPr>
+              <w:fldChar w:fldCharType="end"/>
+            </w:r>
+          </w:hyperlink>
+        </w:p>
+        <w:p>
+          <w:pPr>
+            <w:pStyle w:val="TOC1"/>
+            <w:tabs>
+              <w:tab w:val="right" w:leader="dot" w:pos="9016"/>
+            </w:tabs>
+            <w:rPr>
+              <w:rFonts w:asciiTheme="minorHAnsi" w:hAnsiTheme="minorHAnsi" w:cstheme="minorBidi"/>
+              <w:noProof/>
+              <w:sz w:val="24"/>
+              <w:szCs w:val="24"/>
+            </w:rPr>
+          </w:pPr>
+          <w:hyperlink w:anchor="_Toc230201366" w:history="1">
+            <w:r>
+              <w:rPr>
+                <w:rStyle w:val="Hyperlink"/>
+                <w:noProof/>
+                <w:lang w:val="el-GR"/>
+              </w:rPr>
+              <w:t>8. Πειραματική αξιολόγηση</w:t>
+            </w:r>
+            <w:r>
+              <w:rPr>
+                <w:noProof/>
+                <w:webHidden/>
+              </w:rPr>
+              <w:tab/>
+            </w:r>
+            <w:r>
+              <w:rPr>
+                <w:noProof/>
+                <w:webHidden/>
+              </w:rPr>
+              <w:fldChar w:fldCharType="begin"/>
+            </w:r>
+            <w:r>
+              <w:rPr>
+                <w:noProof/>
+                <w:webHidden/>
+              </w:rPr>
+              <w:instrText xml:space="preserve"> PAGEREF _Toc230201366 \h </w:instrText>
+            </w:r>
+            <w:r>
+              <w:rPr>
+                <w:noProof/>
+                <w:webHidden/>
+              </w:rPr>
+            </w:r>
+            <w:r>
+              <w:rPr>
+                <w:noProof/>
+                <w:webHidden/>
+              </w:rPr>
+              <w:fldChar w:fldCharType="separate"/>
+            </w:r>
+            <w:r>
+              <w:rPr>
+                <w:noProof/>
+                <w:webHidden/>
+              </w:rPr>
+              <w:t>7</w:t>
             </w:r>
             <w:r>
               <w:rPr>
@@ -1158,21 +1297,84 @@
               <w:szCs w:val="24"/>
             </w:rPr>
           </w:pPr>
-          <w:hyperlink w:anchor="_Toc230193509" w:history="1">
+          <w:hyperlink w:anchor="_Toc230201367" w:history="1">
             <w:r>
               <w:rPr>
                 <w:rStyle w:val="Hyperlink"/>
                 <w:noProof/>
-                <w:lang w:val="el-GR"/>
-              </w:rPr>
-              <w:t xml:space="preserve">Παράγοντες που μπορεί να περιορίσουν το </w:t>
-            </w:r>
+              </w:rPr>
+              <w:t>Προτεινόμενα datasets</w:t>
+            </w:r>
+            <w:r>
+              <w:rPr>
+                <w:noProof/>
+                <w:webHidden/>
+              </w:rPr>
+              <w:tab/>
+            </w:r>
+            <w:r>
+              <w:rPr>
+                <w:noProof/>
+                <w:webHidden/>
+              </w:rPr>
+              <w:fldChar w:fldCharType="begin"/>
+            </w:r>
+            <w:r>
+              <w:rPr>
+                <w:noProof/>
+                <w:webHidden/>
+              </w:rPr>
+              <w:instrText xml:space="preserve"> PAGEREF _Toc230201367 \h </w:instrText>
+            </w:r>
+            <w:r>
+              <w:rPr>
+                <w:noProof/>
+                <w:webHidden/>
+              </w:rPr>
+            </w:r>
+            <w:r>
+              <w:rPr>
+                <w:noProof/>
+                <w:webHidden/>
+              </w:rPr>
+              <w:fldChar w:fldCharType="separate"/>
+            </w:r>
+            <w:r>
+              <w:rPr>
+                <w:noProof/>
+                <w:webHidden/>
+              </w:rPr>
+              <w:t>7</w:t>
+            </w:r>
+            <w:r>
+              <w:rPr>
+                <w:noProof/>
+                <w:webHidden/>
+              </w:rPr>
+              <w:fldChar w:fldCharType="end"/>
+            </w:r>
+          </w:hyperlink>
+        </w:p>
+        <w:p>
+          <w:pPr>
+            <w:pStyle w:val="TOC2"/>
+            <w:tabs>
+              <w:tab w:val="right" w:leader="dot" w:pos="9016"/>
+            </w:tabs>
+            <w:rPr>
+              <w:rFonts w:asciiTheme="minorHAnsi" w:hAnsiTheme="minorHAnsi" w:cstheme="minorBidi"/>
+              <w:noProof/>
+              <w:sz w:val="24"/>
+              <w:szCs w:val="24"/>
+            </w:rPr>
+          </w:pPr>
+          <w:hyperlink w:anchor="_Toc230201368" w:history="1">
             <w:r>
               <w:rPr>
                 <w:rStyle w:val="Hyperlink"/>
                 <w:noProof/>
               </w:rPr>
-              <w:t>speedup</w:t>
+              <w:t>Πίνακας αποτελεσμάτων προς συμπλήρωση</w:t>
             </w:r>
             <w:r>
               <w:rPr>
@@ -1193,7 +1395,7 @@
                 <w:noProof/>
                 <w:webHidden/>
               </w:rPr>
-              <w:instrText xml:space="preserve"> PAGEREF _Toc230193509 \h </w:instrText>
+              <w:instrText xml:space="preserve"> PAGEREF _Toc230201368 \h </w:instrText>
             </w:r>
             <w:r>
               <w:rPr>
@@ -1213,7 +1415,7 @@
                 <w:noProof/>
                 <w:webHidden/>
               </w:rPr>
-              <w:t>6</w:t>
+              <w:t>8</w:t>
             </w:r>
             <w:r>
               <w:rPr>
@@ -1237,14 +1439,14 @@
               <w:szCs w:val="24"/>
             </w:rPr>
           </w:pPr>
-          <w:hyperlink w:anchor="_Toc230193510" w:history="1">
+          <w:hyperlink w:anchor="_Toc230201369" w:history="1">
             <w:r>
               <w:rPr>
                 <w:rStyle w:val="Hyperlink"/>
                 <w:noProof/>
                 <w:lang w:val="el-GR"/>
               </w:rPr>
-              <w:t>7. Έλεγχος ορθότητας</w:t>
+              <w:t>10. Συμπεράσματα</w:t>
             </w:r>
             <w:r>
               <w:rPr>
@@ -1265,7 +1467,7 @@
                 <w:noProof/>
                 <w:webHidden/>
               </w:rPr>
-              <w:instrText xml:space="preserve"> PAGEREF _Toc230193510 \h </w:instrText>
+              <w:instrText xml:space="preserve"> PAGEREF _Toc230201369 \h </w:instrText>
             </w:r>
             <w:r>
               <w:rPr>
@@ -1285,7 +1487,79 @@
                 <w:noProof/>
                 <w:webHidden/>
               </w:rPr>
-              <w:t>6</w:t>
+              <w:t>8</w:t>
+            </w:r>
+            <w:r>
+              <w:rPr>
+                <w:noProof/>
+                <w:webHidden/>
+              </w:rPr>
+              <w:fldChar w:fldCharType="end"/>
+            </w:r>
+          </w:hyperlink>
+        </w:p>
+        <w:p>
+          <w:pPr>
+            <w:pStyle w:val="TOC1"/>
+            <w:tabs>
+              <w:tab w:val="right" w:leader="dot" w:pos="9016"/>
+            </w:tabs>
+            <w:rPr>
+              <w:rFonts w:asciiTheme="minorHAnsi" w:hAnsiTheme="minorHAnsi" w:cstheme="minorBidi"/>
+              <w:noProof/>
+              <w:sz w:val="24"/>
+              <w:szCs w:val="24"/>
+            </w:rPr>
+          </w:pPr>
+          <w:hyperlink w:anchor="_Toc230201370" w:history="1">
+            <w:r>
+              <w:rPr>
+                <w:rStyle w:val="Hyperlink"/>
+                <w:noProof/>
+                <w:lang w:val="el-GR"/>
+              </w:rPr>
+              <w:t>Παράρτημα Α: Ενδεικτικές εντολές εκτέλεσης</w:t>
+            </w:r>
+            <w:r>
+              <w:rPr>
+                <w:noProof/>
+                <w:webHidden/>
+              </w:rPr>
+              <w:tab/>
+            </w:r>
+            <w:r>
+              <w:rPr>
+                <w:noProof/>
+                <w:webHidden/>
+              </w:rPr>
+              <w:fldChar w:fldCharType="begin"/>
+            </w:r>
+            <w:r>
+              <w:rPr>
+                <w:noProof/>
+                <w:webHidden/>
+              </w:rPr>
+              <w:instrText xml:space="preserve"> PAGEREF _Toc230201370 \h </w:instrText>
+            </w:r>
+            <w:r>
+              <w:rPr>
+                <w:noProof/>
+                <w:webHidden/>
+              </w:rPr>
+            </w:r>
+            <w:r>
+              <w:rPr>
+                <w:noProof/>
+                <w:webHidden/>
+              </w:rPr>
+              <w:fldChar w:fldCharType="separate"/>
+            </w:r>
+            <w:r>
+              <w:rPr>
+                <w:noProof/>
+                <w:webHidden/>
+              </w:rPr>
+              <w:t>9</w:t>
             </w:r>
             <w:r>
               <w:rPr>
@@ -1309,14 +1583,28 @@
               <w:szCs w:val="24"/>
             </w:rPr>
           </w:pPr>
-          <w:hyperlink w:anchor="_Toc230193511" w:history="1">
+          <w:hyperlink w:anchor="_Toc230201371" w:history="1">
             <w:r>
               <w:rPr>
                 <w:rStyle w:val="Hyperlink"/>
                 <w:noProof/>
+              </w:rPr>
+              <w:t>Build</w:t>
+            </w:r>
+            <w:r>
+              <w:rPr>
+                <w:rStyle w:val="Hyperlink"/>
+                <w:noProof/>
                 <w:lang w:val="el-GR"/>
               </w:rPr>
-              <w:t>Ενδεικτικός μικρός έλεγχος κατά τη σύνταξη της αναφοράς</w:t>
+              <w:t xml:space="preserve"> μέσω </w:t>
+            </w:r>
+            <w:r>
+              <w:rPr>
+                <w:rStyle w:val="Hyperlink"/>
+                <w:noProof/>
+              </w:rPr>
+              <w:t>Makefile</w:t>
             </w:r>
             <w:r>
               <w:rPr>
@@ -1337,7 +1625,7 @@
                 <w:noProof/>
                 <w:webHidden/>
               </w:rPr>
-              <w:instrText xml:space="preserve"> PAGEREF _Toc230193511 \h </w:instrText>
+              <w:instrText xml:space="preserve"> PAGEREF _Toc230201371 \h </w:instrText>
             </w:r>
             <w:r>
               <w:rPr>
@@ -1357,79 +1645,7 @@
                 <w:noProof/>
                 <w:webHidden/>
               </w:rPr>
-              <w:t>6</w:t>
-            </w:r>
-            <w:r>
-              <w:rPr>
-                <w:noProof/>
-                <w:webHidden/>
-              </w:rPr>
-              <w:fldChar w:fldCharType="end"/>
-            </w:r>
-          </w:hyperlink>
-        </w:p>
-        <w:p>
-          <w:pPr>
-            <w:pStyle w:val="TOC1"/>
-            <w:tabs>
-              <w:tab w:val="right" w:leader="dot" w:pos="9016"/>
-            </w:tabs>
-            <w:rPr>
-              <w:rFonts w:asciiTheme="minorHAnsi" w:hAnsiTheme="minorHAnsi" w:cstheme="minorBidi"/>
-              <w:noProof/>
-              <w:sz w:val="24"/>
-              <w:szCs w:val="24"/>
-            </w:rPr>
-          </w:pPr>
-          <w:hyperlink w:anchor="_Toc230193512" w:history="1">
-            <w:r>
-              <w:rPr>
-                <w:rStyle w:val="Hyperlink"/>
-                <w:noProof/>
-                <w:lang w:val="el-GR"/>
-              </w:rPr>
-              <w:t>8. Πειραματική αξιολόγηση</w:t>
-            </w:r>
-            <w:r>
-              <w:rPr>
-                <w:noProof/>
-                <w:webHidden/>
-              </w:rPr>
-              <w:tab/>
-            </w:r>
-            <w:r>
-              <w:rPr>
-                <w:noProof/>
-                <w:webHidden/>
-              </w:rPr>
-              <w:fldChar w:fldCharType="begin"/>
-            </w:r>
-            <w:r>
-              <w:rPr>
-                <w:noProof/>
-                <w:webHidden/>
-              </w:rPr>
-              <w:instrText xml:space="preserve"> PAGEREF _Toc230193512 \h </w:instrText>
-            </w:r>
-            <w:r>
-              <w:rPr>
-                <w:noProof/>
-                <w:webHidden/>
-              </w:rPr>
-            </w:r>
-            <w:r>
-              <w:rPr>
-                <w:noProof/>
-                <w:webHidden/>
-              </w:rPr>
-              <w:fldChar w:fldCharType="separate"/>
-            </w:r>
-            <w:r>
-              <w:rPr>
-                <w:noProof/>
-                <w:webHidden/>
-              </w:rPr>
-              <w:t>7</w:t>
+              <w:t>9</w:t>
             </w:r>
             <w:r>
               <w:rPr>
@@ -1453,13 +1669,13 @@
               <w:szCs w:val="24"/>
             </w:rPr>
           </w:pPr>
-          <w:hyperlink w:anchor="_Toc230193513" w:history="1">
+          <w:hyperlink w:anchor="_Toc230201372" w:history="1">
             <w:r>
               <w:rPr>
                 <w:rStyle w:val="Hyperlink"/>
                 <w:noProof/>
               </w:rPr>
-              <w:t>Προτεινόμενα datasets</w:t>
+              <w:t>Παραγωγή δεδομένων</w:t>
             </w:r>
             <w:r>
               <w:rPr>
@@ -1480,7 +1696,7 @@
                 <w:noProof/>
                 <w:webHidden/>
               </w:rPr>
-              <w:instrText xml:space="preserve"> PAGEREF _Toc230193513 \h </w:instrText>
+              <w:instrText xml:space="preserve"> PAGEREF _Toc230201372 \h </w:instrText>
             </w:r>
             <w:r>
               <w:rPr>
@@ -1500,7 +1716,7 @@
                 <w:noProof/>
                 <w:webHidden/>
               </w:rPr>
-              <w:t>7</w:t>
+              <w:t>9</w:t>
             </w:r>
             <w:r>
               <w:rPr>
@@ -1524,13 +1740,44 @@
               <w:szCs w:val="24"/>
             </w:rPr>
           </w:pPr>
-          <w:hyperlink w:anchor="_Toc230193514" w:history="1">
+          <w:hyperlink w:anchor="_Toc230201373" w:history="1">
             <w:r>
               <w:rPr>
                 <w:rStyle w:val="Hyperlink"/>
                 <w:noProof/>
-              </w:rPr>
-              <w:t>Πίνακας αποτελεσμάτων προς συμπλήρωση</w:t>
+                <w:lang w:val="el-GR"/>
+              </w:rPr>
+              <w:t>Εκτέλεση</w:t>
+            </w:r>
+            <w:r>
+              <w:rPr>
+                <w:rStyle w:val="Hyperlink"/>
+                <w:noProof/>
+              </w:rPr>
+              <w:t xml:space="preserve"> </w:t>
+            </w:r>
+            <w:r>
+              <w:rPr>
+                <w:rStyle w:val="Hyperlink"/>
+                <w:noProof/>
+                <w:lang w:val="el-GR"/>
+              </w:rPr>
+              <w:t>σειριακής</w:t>
+            </w:r>
+            <w:r>
+              <w:rPr>
+                <w:rStyle w:val="Hyperlink"/>
+                <w:noProof/>
+              </w:rPr>
+              <w:t xml:space="preserve"> </w:t>
+            </w:r>
+            <w:r>
+              <w:rPr>
+                <w:rStyle w:val="Hyperlink"/>
+                <w:noProof/>
+                <w:lang w:val="el-GR"/>
+              </w:rPr>
+              <w:t>έκδοσης</w:t>
             </w:r>
             <w:r>
               <w:rPr>
@@ -1551,7 +1798,7 @@
                 <w:noProof/>
                 <w:webHidden/>
               </w:rPr>
-              <w:instrText xml:space="preserve"> PAGEREF _Toc230193514 \h </w:instrText>
+              <w:instrText xml:space="preserve"> PAGEREF _Toc230201373 \h </w:instrText>
             </w:r>
             <w:r>
               <w:rPr>
@@ -1571,7 +1818,7 @@
                 <w:noProof/>
                 <w:webHidden/>
               </w:rPr>
-              <w:t>7</w:t>
+              <w:t>9</w:t>
             </w:r>
             <w:r>
               <w:rPr>
@@ -1595,13 +1842,13 @@
               <w:szCs w:val="24"/>
             </w:rPr>
           </w:pPr>
-          <w:hyperlink w:anchor="_Toc230193515" w:history="1">
+          <w:hyperlink w:anchor="_Toc230201374" w:history="1">
             <w:r>
               <w:rPr>
                 <w:rStyle w:val="Hyperlink"/>
                 <w:noProof/>
               </w:rPr>
-              <w:t>Πληροφορίες μηχανήματος προς συμπλήρωση</w:t>
+              <w:t>Εκτέλεση SIMD έκδοσης</w:t>
             </w:r>
             <w:r>
               <w:rPr>
@@ -1622,7 +1869,7 @@
                 <w:noProof/>
                 <w:webHidden/>
               </w:rPr>
-              <w:instrText xml:space="preserve"> PAGEREF _Toc230193515 \h </w:instrText>
+              <w:instrText xml:space="preserve"> PAGEREF _Toc230201374 \h </w:instrText>
             </w:r>
             <w:r>
               <w:rPr>
@@ -1642,116 +1889,7 @@
                 <w:noProof/>
                 <w:webHidden/>
               </w:rPr>
-              <w:t>8</w:t>
-            </w:r>
-            <w:r>
-              <w:rPr>
-                <w:noProof/>
-                <w:webHidden/>
-              </w:rPr>
-              <w:fldChar w:fldCharType="end"/>
-            </w:r>
-          </w:hyperlink>
-        </w:p>
-        <w:p>
-          <w:pPr>
-            <w:pStyle w:val="TOC1"/>
-            <w:tabs>
-              <w:tab w:val="right" w:leader="dot" w:pos="9016"/>
-            </w:tabs>
-            <w:rPr>
-              <w:rFonts w:asciiTheme="minorHAnsi" w:hAnsiTheme="minorHAnsi" w:cstheme="minorBidi"/>
-              <w:noProof/>
-              <w:sz w:val="24"/>
-              <w:szCs w:val="24"/>
-            </w:rPr>
-          </w:pPr>
-          <w:hyperlink w:anchor="_Toc230193516" w:history="1">
-            <w:r>
-              <w:rPr>
-                <w:rStyle w:val="Hyperlink"/>
-                <w:noProof/>
-                <w:lang w:val="el-GR"/>
-              </w:rPr>
-              <w:t xml:space="preserve">9. Μελλοντικές υλοποιήσεις </w:t>
-            </w:r>
-            <w:r>
-              <w:rPr>
-                <w:rStyle w:val="Hyperlink"/>
-                <w:noProof/>
-              </w:rPr>
-              <w:t>OpenMP</w:t>
-            </w:r>
-            <w:r>
-              <w:rPr>
-                <w:rStyle w:val="Hyperlink"/>
-                <w:noProof/>
-                <w:lang w:val="el-GR"/>
-              </w:rPr>
-              <w:t xml:space="preserve">, </w:t>
-            </w:r>
-            <w:r>
-              <w:rPr>
-                <w:rStyle w:val="Hyperlink"/>
-                <w:noProof/>
-              </w:rPr>
-              <w:t>MPI</w:t>
-            </w:r>
-            <w:r>
-              <w:rPr>
-                <w:rStyle w:val="Hyperlink"/>
-                <w:noProof/>
-                <w:lang w:val="el-GR"/>
-              </w:rPr>
-              <w:t xml:space="preserve"> και </w:t>
-            </w:r>
-            <w:r>
-              <w:rPr>
-                <w:rStyle w:val="Hyperlink"/>
-                <w:noProof/>
-              </w:rPr>
-              <w:t>CUDA</w:t>
-            </w:r>
-            <w:r>
-              <w:rPr>
-                <w:noProof/>
-                <w:webHidden/>
-              </w:rPr>
-              <w:tab/>
-            </w:r>
-            <w:r>
-              <w:rPr>
-                <w:noProof/>
-                <w:webHidden/>
-              </w:rPr>
-              <w:fldChar w:fldCharType="begin"/>
-            </w:r>
-            <w:r>
-              <w:rPr>
-                <w:noProof/>
-                <w:webHidden/>
-              </w:rPr>
-              <w:instrText xml:space="preserve"> PAGEREF _Toc230193516 \h </w:instrText>
-            </w:r>
-            <w:r>
-              <w:rPr>
-                <w:noProof/>
-                <w:webHidden/>
-              </w:rPr>
-            </w:r>
-            <w:r>
-              <w:rPr>
-                <w:noProof/>
-                <w:webHidden/>
-              </w:rPr>
-              <w:fldChar w:fldCharType="separate"/>
-            </w:r>
-            <w:r>
-              <w:rPr>
-                <w:noProof/>
-                <w:webHidden/>
-              </w:rPr>
-              <w:t>8</w:t>
+              <w:t>9</w:t>
             </w:r>
             <w:r>
               <w:rPr>
@@ -1775,13 +1913,13 @@
               <w:szCs w:val="24"/>
             </w:rPr>
           </w:pPr>
-          <w:hyperlink w:anchor="_Toc230193517" w:history="1">
+          <w:hyperlink w:anchor="_Toc230201375" w:history="1">
             <w:r>
               <w:rPr>
                 <w:rStyle w:val="Hyperlink"/>
                 <w:noProof/>
               </w:rPr>
-              <w:t>OpenMP</w:t>
+              <w:t>Έλεγχος ορθότητας</w:t>
             </w:r>
             <w:r>
               <w:rPr>
@@ -1802,7 +1940,7 @@
                 <w:noProof/>
                 <w:webHidden/>
               </w:rPr>
-              <w:instrText xml:space="preserve"> PAGEREF _Toc230193517 \h </w:instrText>
+              <w:instrText xml:space="preserve"> PAGEREF _Toc230201375 \h </w:instrText>
             </w:r>
             <w:r>
               <w:rPr>
@@ -1822,7 +1960,7 @@
                 <w:noProof/>
                 <w:webHidden/>
               </w:rPr>
-              <w:t>8</w:t>
+              <w:t>9</w:t>
             </w:r>
             <w:r>
               <w:rPr>
@@ -1846,13 +1984,13 @@
               <w:szCs w:val="24"/>
             </w:rPr>
           </w:pPr>
-          <w:hyperlink w:anchor="_Toc230193518" w:history="1">
+          <w:hyperlink w:anchor="_Toc230201376" w:history="1">
             <w:r>
               <w:rPr>
                 <w:rStyle w:val="Hyperlink"/>
                 <w:noProof/>
               </w:rPr>
-              <w:t>MPI</w:t>
+              <w:t>Άμεση μεταγλώττιση χωρίς Makefile</w:t>
             </w:r>
             <w:r>
               <w:rPr>
@@ -1873,7 +2011,7 @@
                 <w:noProof/>
                 <w:webHidden/>
               </w:rPr>
-              <w:instrText xml:space="preserve"> PAGEREF _Toc230193518 \h </w:instrText>
+              <w:instrText xml:space="preserve"> PAGEREF _Toc230201376 \h </w:instrText>
             </w:r>
             <w:r>
               <w:rPr>
@@ -1893,663 +2031,7 @@
                 <w:noProof/>
                 <w:webHidden/>
               </w:rPr>
-              <w:t>8</w:t>
-            </w:r>
-            <w:r>
-              <w:rPr>
-                <w:noProof/>
-                <w:webHidden/>
-              </w:rPr>
-              <w:fldChar w:fldCharType="end"/>
-            </w:r>
-          </w:hyperlink>
-        </w:p>
-        <w:p>
-          <w:pPr>
-            <w:pStyle w:val="TOC2"/>
-            <w:tabs>
-              <w:tab w:val="right" w:leader="dot" w:pos="9016"/>
-            </w:tabs>
-            <w:rPr>
-              <w:rFonts w:asciiTheme="minorHAnsi" w:hAnsiTheme="minorHAnsi" w:cstheme="minorBidi"/>
-              <w:noProof/>
-              <w:sz w:val="24"/>
-              <w:szCs w:val="24"/>
-            </w:rPr>
-          </w:pPr>
-          <w:hyperlink w:anchor="_Toc230193519" w:history="1">
-            <w:r>
-              <w:rPr>
-                <w:rStyle w:val="Hyperlink"/>
-                <w:noProof/>
-              </w:rPr>
-              <w:t>CUDA</w:t>
-            </w:r>
-            <w:r>
-              <w:rPr>
-                <w:noProof/>
-                <w:webHidden/>
-              </w:rPr>
-              <w:tab/>
-            </w:r>
-            <w:r>
-              <w:rPr>
-                <w:noProof/>
-                <w:webHidden/>
-              </w:rPr>
-              <w:fldChar w:fldCharType="begin"/>
-            </w:r>
-            <w:r>
-              <w:rPr>
-                <w:noProof/>
-                <w:webHidden/>
-              </w:rPr>
-              <w:instrText xml:space="preserve"> PAGEREF _Toc230193519 \h </w:instrText>
-            </w:r>
-            <w:r>
-              <w:rPr>
-                <w:noProof/>
-                <w:webHidden/>
-              </w:rPr>
-            </w:r>
-            <w:r>
-              <w:rPr>
-                <w:noProof/>
-                <w:webHidden/>
-              </w:rPr>
-              <w:fldChar w:fldCharType="separate"/>
-            </w:r>
-            <w:r>
-              <w:rPr>
-                <w:noProof/>
-                <w:webHidden/>
-              </w:rPr>
               <w:t>9</w:t>
-            </w:r>
-            <w:r>
-              <w:rPr>
-                <w:noProof/>
-                <w:webHidden/>
-              </w:rPr>
-              <w:fldChar w:fldCharType="end"/>
-            </w:r>
-          </w:hyperlink>
-        </w:p>
-        <w:p>
-          <w:pPr>
-            <w:pStyle w:val="TOC1"/>
-            <w:tabs>
-              <w:tab w:val="right" w:leader="dot" w:pos="9016"/>
-            </w:tabs>
-            <w:rPr>
-              <w:rFonts w:asciiTheme="minorHAnsi" w:hAnsiTheme="minorHAnsi" w:cstheme="minorBidi"/>
-              <w:noProof/>
-              <w:sz w:val="24"/>
-              <w:szCs w:val="24"/>
-            </w:rPr>
-          </w:pPr>
-          <w:hyperlink w:anchor="_Toc230193520" w:history="1">
-            <w:r>
-              <w:rPr>
-                <w:rStyle w:val="Hyperlink"/>
-                <w:noProof/>
-                <w:lang w:val="el-GR"/>
-              </w:rPr>
-              <w:t>10. Συμπεράσματα</w:t>
-            </w:r>
-            <w:r>
-              <w:rPr>
-                <w:noProof/>
-                <w:webHidden/>
-              </w:rPr>
-              <w:tab/>
-            </w:r>
-            <w:r>
-              <w:rPr>
-                <w:noProof/>
-                <w:webHidden/>
-              </w:rPr>
-              <w:fldChar w:fldCharType="begin"/>
-            </w:r>
-            <w:r>
-              <w:rPr>
-                <w:noProof/>
-                <w:webHidden/>
-              </w:rPr>
-              <w:instrText xml:space="preserve"> PAGEREF _Toc230193520 \h </w:instrText>
-            </w:r>
-            <w:r>
-              <w:rPr>
-                <w:noProof/>
-                <w:webHidden/>
-              </w:rPr>
-            </w:r>
-            <w:r>
-              <w:rPr>
-                <w:noProof/>
-                <w:webHidden/>
-              </w:rPr>
-              <w:fldChar w:fldCharType="separate"/>
-            </w:r>
-            <w:r>
-              <w:rPr>
-                <w:noProof/>
-                <w:webHidden/>
-              </w:rPr>
-              <w:t>9</w:t>
-            </w:r>
-            <w:r>
-              <w:rPr>
-                <w:noProof/>
-                <w:webHidden/>
-              </w:rPr>
-              <w:fldChar w:fldCharType="end"/>
-            </w:r>
-          </w:hyperlink>
-        </w:p>
-        <w:p>
-          <w:pPr>
-            <w:pStyle w:val="TOC1"/>
-            <w:tabs>
-              <w:tab w:val="right" w:leader="dot" w:pos="9016"/>
-            </w:tabs>
-            <w:rPr>
-              <w:rFonts w:asciiTheme="minorHAnsi" w:hAnsiTheme="minorHAnsi" w:cstheme="minorBidi"/>
-              <w:noProof/>
-              <w:sz w:val="24"/>
-              <w:szCs w:val="24"/>
-            </w:rPr>
-          </w:pPr>
-          <w:hyperlink w:anchor="_Toc230193521" w:history="1">
-            <w:r>
-              <w:rPr>
-                <w:rStyle w:val="Hyperlink"/>
-                <w:noProof/>
-                <w:lang w:val="el-GR"/>
-              </w:rPr>
-              <w:t>Παράρτημα Α: Ενδεικτικές εντολές εκτέλεσης</w:t>
-            </w:r>
-            <w:r>
-              <w:rPr>
-                <w:noProof/>
-                <w:webHidden/>
-              </w:rPr>
-              <w:tab/>
-            </w:r>
-            <w:r>
-              <w:rPr>
-                <w:noProof/>
-                <w:webHidden/>
-              </w:rPr>
-              <w:fldChar w:fldCharType="begin"/>
-            </w:r>
-            <w:r>
-              <w:rPr>
-                <w:noProof/>
-                <w:webHidden/>
-              </w:rPr>
-              <w:instrText xml:space="preserve"> PAGEREF _Toc230193521 \h </w:instrText>
-            </w:r>
-            <w:r>
-              <w:rPr>
-                <w:noProof/>
-                <w:webHidden/>
-              </w:rPr>
-            </w:r>
-            <w:r>
-              <w:rPr>
-                <w:noProof/>
-                <w:webHidden/>
-              </w:rPr>
-              <w:fldChar w:fldCharType="separate"/>
-            </w:r>
-            <w:r>
-              <w:rPr>
-                <w:noProof/>
-                <w:webHidden/>
-              </w:rPr>
-              <w:t>10</w:t>
-            </w:r>
-            <w:r>
-              <w:rPr>
-                <w:noProof/>
-                <w:webHidden/>
-              </w:rPr>
-              <w:fldChar w:fldCharType="end"/>
-            </w:r>
-          </w:hyperlink>
-        </w:p>
-        <w:p>
-          <w:pPr>
-            <w:pStyle w:val="TOC2"/>
-            <w:tabs>
-              <w:tab w:val="right" w:leader="dot" w:pos="9016"/>
-            </w:tabs>
-            <w:rPr>
-              <w:rFonts w:asciiTheme="minorHAnsi" w:hAnsiTheme="minorHAnsi" w:cstheme="minorBidi"/>
-              <w:noProof/>
-              <w:sz w:val="24"/>
-              <w:szCs w:val="24"/>
-            </w:rPr>
-          </w:pPr>
-          <w:hyperlink w:anchor="_Toc230193522" w:history="1">
-            <w:r>
-              <w:rPr>
-                <w:rStyle w:val="Hyperlink"/>
-                <w:noProof/>
-              </w:rPr>
-              <w:t>Build</w:t>
-            </w:r>
-            <w:r>
-              <w:rPr>
-                <w:rStyle w:val="Hyperlink"/>
-                <w:noProof/>
-                <w:lang w:val="el-GR"/>
-              </w:rPr>
-              <w:t xml:space="preserve"> μέσω </w:t>
-            </w:r>
-            <w:r>
-              <w:rPr>
-                <w:rStyle w:val="Hyperlink"/>
-                <w:noProof/>
-              </w:rPr>
-              <w:t>Makefile</w:t>
-            </w:r>
-            <w:r>
-              <w:rPr>
-                <w:noProof/>
-                <w:webHidden/>
-              </w:rPr>
-              <w:tab/>
-            </w:r>
-            <w:r>
-              <w:rPr>
-                <w:noProof/>
-                <w:webHidden/>
-              </w:rPr>
-              <w:fldChar w:fldCharType="begin"/>
-            </w:r>
-            <w:r>
-              <w:rPr>
-                <w:noProof/>
-                <w:webHidden/>
-              </w:rPr>
-              <w:instrText xml:space="preserve"> PAGEREF _Toc230193522 \h </w:instrText>
-            </w:r>
-            <w:r>
-              <w:rPr>
-                <w:noProof/>
-                <w:webHidden/>
-              </w:rPr>
-            </w:r>
-            <w:r>
-              <w:rPr>
-                <w:noProof/>
-                <w:webHidden/>
-              </w:rPr>
-              <w:fldChar w:fldCharType="separate"/>
-            </w:r>
-            <w:r>
-              <w:rPr>
-                <w:noProof/>
-                <w:webHidden/>
-              </w:rPr>
-              <w:t>10</w:t>
-            </w:r>
-            <w:r>
-              <w:rPr>
-                <w:noProof/>
-                <w:webHidden/>
-              </w:rPr>
-              <w:fldChar w:fldCharType="end"/>
-            </w:r>
-          </w:hyperlink>
-        </w:p>
-        <w:p>
-          <w:pPr>
-            <w:pStyle w:val="TOC2"/>
-            <w:tabs>
-              <w:tab w:val="right" w:leader="dot" w:pos="9016"/>
-            </w:tabs>
-            <w:rPr>
-              <w:rFonts w:asciiTheme="minorHAnsi" w:hAnsiTheme="minorHAnsi" w:cstheme="minorBidi"/>
-              <w:noProof/>
-              <w:sz w:val="24"/>
-              <w:szCs w:val="24"/>
-            </w:rPr>
-          </w:pPr>
-          <w:hyperlink w:anchor="_Toc230193523" w:history="1">
-            <w:r>
-              <w:rPr>
-                <w:rStyle w:val="Hyperlink"/>
-                <w:noProof/>
-              </w:rPr>
-              <w:t>Παραγωγή δεδομένων</w:t>
-            </w:r>
-            <w:r>
-              <w:rPr>
-                <w:noProof/>
-                <w:webHidden/>
-              </w:rPr>
-              <w:tab/>
-            </w:r>
-            <w:r>
-              <w:rPr>
-                <w:noProof/>
-                <w:webHidden/>
-              </w:rPr>
-              <w:fldChar w:fldCharType="begin"/>
-            </w:r>
-            <w:r>
-              <w:rPr>
-                <w:noProof/>
-                <w:webHidden/>
-              </w:rPr>
-              <w:instrText xml:space="preserve"> PAGEREF _Toc230193523 \h </w:instrText>
-            </w:r>
-            <w:r>
-              <w:rPr>
-                <w:noProof/>
-                <w:webHidden/>
-              </w:rPr>
-            </w:r>
-            <w:r>
-              <w:rPr>
-                <w:noProof/>
-                <w:webHidden/>
-              </w:rPr>
-              <w:fldChar w:fldCharType="separate"/>
-            </w:r>
-            <w:r>
-              <w:rPr>
-                <w:noProof/>
-                <w:webHidden/>
-              </w:rPr>
-              <w:t>10</w:t>
-            </w:r>
-            <w:r>
-              <w:rPr>
-                <w:noProof/>
-                <w:webHidden/>
-              </w:rPr>
-              <w:fldChar w:fldCharType="end"/>
-            </w:r>
-          </w:hyperlink>
-        </w:p>
-        <w:p>
-          <w:pPr>
-            <w:pStyle w:val="TOC2"/>
-            <w:tabs>
-              <w:tab w:val="right" w:leader="dot" w:pos="9016"/>
-            </w:tabs>
-            <w:rPr>
-              <w:rFonts w:asciiTheme="minorHAnsi" w:hAnsiTheme="minorHAnsi" w:cstheme="minorBidi"/>
-              <w:noProof/>
-              <w:sz w:val="24"/>
-              <w:szCs w:val="24"/>
-            </w:rPr>
-          </w:pPr>
-          <w:hyperlink w:anchor="_Toc230193524" w:history="1">
-            <w:r>
-              <w:rPr>
-                <w:rStyle w:val="Hyperlink"/>
-                <w:noProof/>
-              </w:rPr>
-              <w:t>Εκτέλεση σειριακής έκδοσης</w:t>
-            </w:r>
-            <w:r>
-              <w:rPr>
-                <w:noProof/>
-                <w:webHidden/>
-              </w:rPr>
-              <w:tab/>
-            </w:r>
-            <w:r>
-              <w:rPr>
-                <w:noProof/>
-                <w:webHidden/>
-              </w:rPr>
-              <w:fldChar w:fldCharType="begin"/>
-            </w:r>
-            <w:r>
-              <w:rPr>
-                <w:noProof/>
-                <w:webHidden/>
-              </w:rPr>
-              <w:instrText xml:space="preserve"> PAGEREF _Toc230193524 \h </w:instrText>
-            </w:r>
-            <w:r>
-              <w:rPr>
-                <w:noProof/>
-                <w:webHidden/>
-              </w:rPr>
-            </w:r>
-            <w:r>
-              <w:rPr>
-                <w:noProof/>
-                <w:webHidden/>
-              </w:rPr>
-              <w:fldChar w:fldCharType="separate"/>
-            </w:r>
-            <w:r>
-              <w:rPr>
-                <w:noProof/>
-                <w:webHidden/>
-              </w:rPr>
-              <w:t>10</w:t>
-            </w:r>
-            <w:r>
-              <w:rPr>
-                <w:noProof/>
-                <w:webHidden/>
-              </w:rPr>
-              <w:fldChar w:fldCharType="end"/>
-            </w:r>
-          </w:hyperlink>
-        </w:p>
-        <w:p>
-          <w:pPr>
-            <w:pStyle w:val="TOC2"/>
-            <w:tabs>
-              <w:tab w:val="right" w:leader="dot" w:pos="9016"/>
-            </w:tabs>
-            <w:rPr>
-              <w:rFonts w:asciiTheme="minorHAnsi" w:hAnsiTheme="minorHAnsi" w:cstheme="minorBidi"/>
-              <w:noProof/>
-              <w:sz w:val="24"/>
-              <w:szCs w:val="24"/>
-            </w:rPr>
-          </w:pPr>
-          <w:hyperlink w:anchor="_Toc230193525" w:history="1">
-            <w:r>
-              <w:rPr>
-                <w:rStyle w:val="Hyperlink"/>
-                <w:noProof/>
-              </w:rPr>
-              <w:t>Εκτέλεση SIMD έκδοσης</w:t>
-            </w:r>
-            <w:r>
-              <w:rPr>
-                <w:noProof/>
-                <w:webHidden/>
-              </w:rPr>
-              <w:tab/>
-            </w:r>
-            <w:r>
-              <w:rPr>
-                <w:noProof/>
-                <w:webHidden/>
-              </w:rPr>
-              <w:fldChar w:fldCharType="begin"/>
-            </w:r>
-            <w:r>
-              <w:rPr>
-                <w:noProof/>
-                <w:webHidden/>
-              </w:rPr>
-              <w:instrText xml:space="preserve"> PAGEREF _Toc230193525 \h </w:instrText>
-            </w:r>
-            <w:r>
-              <w:rPr>
-                <w:noProof/>
-                <w:webHidden/>
-              </w:rPr>
-            </w:r>
-            <w:r>
-              <w:rPr>
-                <w:noProof/>
-                <w:webHidden/>
-              </w:rPr>
-              <w:fldChar w:fldCharType="separate"/>
-            </w:r>
-            <w:r>
-              <w:rPr>
-                <w:noProof/>
-                <w:webHidden/>
-              </w:rPr>
-              <w:t>10</w:t>
-            </w:r>
-            <w:r>
-              <w:rPr>
-                <w:noProof/>
-                <w:webHidden/>
-              </w:rPr>
-              <w:fldChar w:fldCharType="end"/>
-            </w:r>
-          </w:hyperlink>
-        </w:p>
-        <w:p>
-          <w:pPr>
-            <w:pStyle w:val="TOC2"/>
-            <w:tabs>
-              <w:tab w:val="right" w:leader="dot" w:pos="9016"/>
-            </w:tabs>
-            <w:rPr>
-              <w:rFonts w:asciiTheme="minorHAnsi" w:hAnsiTheme="minorHAnsi" w:cstheme="minorBidi"/>
-              <w:noProof/>
-              <w:sz w:val="24"/>
-              <w:szCs w:val="24"/>
-            </w:rPr>
-          </w:pPr>
-          <w:hyperlink w:anchor="_Toc230193526" w:history="1">
-            <w:r>
-              <w:rPr>
-                <w:rStyle w:val="Hyperlink"/>
-                <w:noProof/>
-              </w:rPr>
-              <w:t>Έλεγχος ορθότητας</w:t>
-            </w:r>
-            <w:r>
-              <w:rPr>
-                <w:noProof/>
-                <w:webHidden/>
-              </w:rPr>
-              <w:tab/>
-            </w:r>
-            <w:r>
-              <w:rPr>
-                <w:noProof/>
-                <w:webHidden/>
-              </w:rPr>
-              <w:fldChar w:fldCharType="begin"/>
-            </w:r>
-            <w:r>
-              <w:rPr>
-                <w:noProof/>
-                <w:webHidden/>
-              </w:rPr>
-              <w:instrText xml:space="preserve"> PAGEREF _Toc230193526 \h </w:instrText>
-            </w:r>
-            <w:r>
-              <w:rPr>
-                <w:noProof/>
-                <w:webHidden/>
-              </w:rPr>
-            </w:r>
-            <w:r>
-              <w:rPr>
-                <w:noProof/>
-                <w:webHidden/>
-              </w:rPr>
-              <w:fldChar w:fldCharType="separate"/>
-            </w:r>
-            <w:r>
-              <w:rPr>
-                <w:noProof/>
-                <w:webHidden/>
-              </w:rPr>
-              <w:t>10</w:t>
-            </w:r>
-            <w:r>
-              <w:rPr>
-                <w:noProof/>
-                <w:webHidden/>
-              </w:rPr>
-              <w:fldChar w:fldCharType="end"/>
-            </w:r>
-          </w:hyperlink>
-        </w:p>
-        <w:p>
-          <w:pPr>
-            <w:pStyle w:val="TOC2"/>
-            <w:tabs>
-              <w:tab w:val="right" w:leader="dot" w:pos="9016"/>
-            </w:tabs>
-            <w:rPr>
-              <w:rFonts w:asciiTheme="minorHAnsi" w:hAnsiTheme="minorHAnsi" w:cstheme="minorBidi"/>
-              <w:noProof/>
-              <w:sz w:val="24"/>
-              <w:szCs w:val="24"/>
-            </w:rPr>
-          </w:pPr>
-          <w:hyperlink w:anchor="_Toc230193527" w:history="1">
-            <w:r>
-              <w:rPr>
-                <w:rStyle w:val="Hyperlink"/>
-                <w:noProof/>
-              </w:rPr>
-              <w:t>Άμεση μεταγλώττιση χωρίς Makefile</w:t>
-            </w:r>
-            <w:r>
-              <w:rPr>
-                <w:noProof/>
-                <w:webHidden/>
-              </w:rPr>
-              <w:tab/>
-            </w:r>
-            <w:r>
-              <w:rPr>
-                <w:noProof/>
-                <w:webHidden/>
-              </w:rPr>
-              <w:fldChar w:fldCharType="begin"/>
-            </w:r>
-            <w:r>
-              <w:rPr>
-                <w:noProof/>
-                <w:webHidden/>
-              </w:rPr>
-              <w:instrText xml:space="preserve"> PAGEREF _Toc230193527 \h </w:instrText>
-            </w:r>
-            <w:r>
-              <w:rPr>
-                <w:noProof/>
-                <w:webHidden/>
-              </w:rPr>
-            </w:r>
-            <w:r>
-              <w:rPr>
-                <w:noProof/>
-                <w:webHidden/>
-              </w:rPr>
-              <w:fldChar w:fldCharType="separate"/>
-            </w:r>
-            <w:r>
-              <w:rPr>
-                <w:noProof/>
-                <w:webHidden/>
-              </w:rPr>
-              <w:t>10</w:t>
             </w:r>
             <w:r>
               <w:rPr>
@@ -2586,12 +2068,11 @@
           <w:lang w:val="el-GR"/>
         </w:rPr>
       </w:pPr>
-      <w:bookmarkStart w:id="0" w:name="_Toc230193500"/>
-      <w:r>
-        <w:rPr>
-          <w:lang w:val="el-GR"/>
-        </w:rPr>
-        <w:lastRenderedPageBreak/>
+      <w:bookmarkStart w:id="0" w:name="_Toc230201356"/>
+      <w:r>
+        <w:rPr>
+          <w:lang w:val="el-GR"/>
+        </w:rPr>
         <w:t>1. Εισαγωγή</w:t>
       </w:r>
       <w:bookmarkEnd w:id="0"/>
@@ -2628,6 +2109,11 @@
       </w:r>
     </w:p>
     <w:p>
+      <w:pPr>
+        <w:rPr>
+          <w:lang w:val="el-GR"/>
+        </w:rPr>
+      </w:pPr>
       <w:r>
         <w:rPr>
           <w:lang w:val="el-GR"/>
@@ -2716,16 +2202,26 @@
         <w:t>.</w:t>
       </w:r>
     </w:p>
-    <w:p/>
+    <w:p>
+      <w:pPr>
+        <w:rPr>
+          <w:lang w:val="el-GR"/>
+        </w:rPr>
+      </w:pPr>
+    </w:p>
     <w:p>
       <w:pPr>
         <w:pStyle w:val="Heading1"/>
         <w:rPr>
           <w:bCs/>
-        </w:rPr>
-      </w:pPr>
-      <w:bookmarkStart w:id="1" w:name="_Toc230193501"/>
-      <w:r>
+          <w:lang w:val="el-GR"/>
+        </w:rPr>
+      </w:pPr>
+      <w:bookmarkStart w:id="1" w:name="_Toc230201357"/>
+      <w:r>
+        <w:rPr>
+          <w:lang w:val="el-GR"/>
+        </w:rPr>
         <w:t>2</w:t>
       </w:r>
       <w:r>
@@ -2737,6 +2233,7 @@
       <w:r>
         <w:rPr>
           <w:bCs/>
+          <w:lang w:val="el-GR"/>
         </w:rPr>
         <w:t>Προδιαγραφές Συστήματος</w:t>
       </w:r>
@@ -2945,12 +2442,9 @@
       <w:pPr>
         <w:pStyle w:val="Heading1"/>
       </w:pPr>
-      <w:bookmarkStart w:id="2" w:name="_Toc230193502"/>
-      <w:r>
-        <w:t>3</w:t>
-      </w:r>
-      <w:r>
-        <w:t xml:space="preserve">. </w:t>
+      <w:bookmarkStart w:id="2" w:name="_Toc230201358"/>
+      <w:r>
+        <w:t xml:space="preserve">3. </w:t>
       </w:r>
       <w:r>
         <w:rPr>
@@ -3194,14 +2688,7 @@
               <w:rPr>
                 <w:lang w:val="el-GR"/>
               </w:rPr>
-              <w:t xml:space="preserve"> </w:t>
-            </w:r>
-            <w:r>
-              <w:rPr>
-                <w:lang w:val="el-GR"/>
-              </w:rPr>
-              <w:lastRenderedPageBreak/>
-              <w:t>επεξεργασία.</w:t>
+              <w:t xml:space="preserve"> επεξεργασία.</w:t>
             </w:r>
           </w:p>
         </w:tc>
@@ -3216,7 +2703,6 @@
               <w:jc w:val="center"/>
             </w:pPr>
             <w:r>
-              <w:lastRenderedPageBreak/>
               <w:t>Scaler_SIMD.cpp</w:t>
             </w:r>
           </w:p>
@@ -3379,6 +2865,7 @@
               <w:rPr>
                 <w:lang w:val="el-GR"/>
               </w:rPr>
+              <w:lastRenderedPageBreak/>
               <w:t>...........</w:t>
             </w:r>
           </w:p>
@@ -3446,7 +2933,7 @@
           <w:lang w:val="el-GR"/>
         </w:rPr>
       </w:pPr>
-      <w:bookmarkStart w:id="3" w:name="_Toc230193503"/>
+      <w:bookmarkStart w:id="3" w:name="_Toc230201359"/>
       <w:r>
         <w:t>4</w:t>
       </w:r>
@@ -3490,6 +2977,7 @@
           <w:bCs/>
           <w:sz w:val="24"/>
           <w:szCs w:val="24"/>
+          <w:lang w:val="el-GR"/>
         </w:rPr>
       </w:pPr>
       <w:r>
@@ -3498,6 +2986,7 @@
           <w:bCs/>
           <w:sz w:val="24"/>
           <w:szCs w:val="24"/>
+          <w:lang w:val="el-GR"/>
         </w:rPr>
         <w:t>Φάση 1 - Υπολογισμός στατιστικών</w:t>
       </w:r>
@@ -3666,6 +3155,7 @@
           <w:bCs/>
           <w:sz w:val="24"/>
           <w:szCs w:val="24"/>
+          <w:lang w:val="el-GR"/>
         </w:rPr>
       </w:pPr>
       <w:r>
@@ -3674,6 +3164,7 @@
           <w:bCs/>
           <w:sz w:val="24"/>
           <w:szCs w:val="24"/>
+          <w:lang w:val="el-GR"/>
         </w:rPr>
         <w:t>Φάση 2 - Μετασχηματισμός και εγγραφή</w:t>
       </w:r>
@@ -3839,8 +3330,20 @@
         <w:t>.</w:t>
       </w:r>
     </w:p>
-    <w:p/>
-    <w:p/>
+    <w:p>
+      <w:pPr>
+        <w:rPr>
+          <w:lang w:val="el-GR"/>
+        </w:rPr>
+      </w:pPr>
+    </w:p>
+    <w:p>
+      <w:pPr>
+        <w:rPr>
+          <w:lang w:val="el-GR"/>
+        </w:rPr>
+      </w:pPr>
+    </w:p>
     <w:p>
       <w:pPr>
         <w:pStyle w:val="Heading1"/>
@@ -3848,7 +3351,7 @@
           <w:lang w:val="el-GR"/>
         </w:rPr>
       </w:pPr>
-      <w:bookmarkStart w:id="4" w:name="_Toc230193504"/>
+      <w:bookmarkStart w:id="4" w:name="_Toc230201360"/>
       <w:r>
         <w:rPr>
           <w:lang w:val="el-GR"/>
@@ -3991,6 +3494,7 @@
         <w:rPr>
           <w:lang w:val="el-GR"/>
         </w:rPr>
+        <w:lastRenderedPageBreak/>
         <w:t xml:space="preserve">• Ανάγνωση </w:t>
       </w:r>
       <w:r>
@@ -4061,6 +3565,11 @@
       </w:r>
     </w:p>
     <w:p>
+      <w:pPr>
+        <w:rPr>
+          <w:lang w:val="el-GR"/>
+        </w:rPr>
+      </w:pPr>
       <w:r>
         <w:rPr>
           <w:lang w:val="el-GR"/>
@@ -4280,7 +3789,7 @@
           <w:lang w:val="el-GR"/>
         </w:rPr>
       </w:pPr>
-      <w:bookmarkStart w:id="5" w:name="_Toc230193505"/>
+      <w:bookmarkStart w:id="5" w:name="_Toc230201361"/>
       <w:r>
         <w:rPr>
           <w:lang w:val="el-GR"/>
@@ -4456,7 +3965,6 @@
           <w:lang w:val="el-GR"/>
         </w:rPr>
       </w:pPr>
-      <w:bookmarkStart w:id="6" w:name="_Toc230193506"/>
       <w:r>
         <w:rPr>
           <w:b/>
@@ -4476,7 +3984,6 @@
         </w:rPr>
         <w:t>vectorized</w:t>
       </w:r>
-      <w:bookmarkEnd w:id="6"/>
     </w:p>
     <w:p>
       <w:pPr>
@@ -4739,7 +4246,6 @@
           <w:lang w:val="el-GR"/>
         </w:rPr>
       </w:pPr>
-      <w:bookmarkStart w:id="7" w:name="_Toc230193507"/>
       <w:r>
         <w:rPr>
           <w:b/>
@@ -4778,7 +4284,6 @@
         </w:rPr>
         <w:t>O</w:t>
       </w:r>
-      <w:bookmarkEnd w:id="7"/>
     </w:p>
     <w:p>
       <w:pPr>
@@ -4969,7 +4474,6 @@
         <w:rPr>
           <w:lang w:val="el-GR"/>
         </w:rPr>
-        <w:lastRenderedPageBreak/>
         <w:t xml:space="preserve">• </w:t>
       </w:r>
       <w:r>
@@ -5104,6 +4608,11 @@
       </w:r>
     </w:p>
     <w:p>
+      <w:pPr>
+        <w:rPr>
+          <w:lang w:val="el-GR"/>
+        </w:rPr>
+      </w:pPr>
       <w:r>
         <w:rPr>
           <w:lang w:val="el-GR"/>
@@ -5165,7 +4674,13 @@
         <w:t>, ώστε το λειτουργικό σύστημα να γνωρίζει ότι η πρόσβαση στο αρχείο είναι σειριακή.</w:t>
       </w:r>
     </w:p>
-    <w:p/>
+    <w:p>
+      <w:pPr>
+        <w:rPr>
+          <w:lang w:val="el-GR"/>
+        </w:rPr>
+      </w:pPr>
+    </w:p>
     <w:p>
       <w:pPr>
         <w:rPr>
@@ -5175,7 +4690,6 @@
           <w:szCs w:val="24"/>
         </w:rPr>
       </w:pPr>
-      <w:bookmarkStart w:id="8" w:name="_Toc230193508"/>
       <w:r>
         <w:rPr>
           <w:b/>
@@ -5185,13 +4699,13 @@
         </w:rPr>
         <w:t>Compiler flags</w:t>
       </w:r>
-      <w:bookmarkEnd w:id="8"/>
     </w:p>
     <w:p>
       <w:pPr>
         <w:pStyle w:val="Code"/>
       </w:pPr>
       <w:r>
+        <w:lastRenderedPageBreak/>
         <w:t>g++ -std=c++17 -O3 -Wall -mavx2 -mfma -march=native -pthread -o scaler_simd Scaler_SIMD.cpp</w:t>
       </w:r>
     </w:p>
@@ -5208,7 +4722,6 @@
           <w:lang w:val="el-GR"/>
         </w:rPr>
       </w:pPr>
-      <w:bookmarkStart w:id="9" w:name="_Toc230193509"/>
       <w:r>
         <w:rPr>
           <w:b/>
@@ -5224,7 +4737,6 @@
         </w:rPr>
         <w:t>speedup</w:t>
       </w:r>
-      <w:bookmarkEnd w:id="9"/>
     </w:p>
     <w:p>
       <w:pPr>
@@ -5343,6 +4855,11 @@
       </w:r>
     </w:p>
     <w:p>
+      <w:pPr>
+        <w:rPr>
+          <w:lang w:val="el-GR"/>
+        </w:rPr>
+      </w:pPr>
       <w:r>
         <w:rPr>
           <w:lang w:val="el-GR"/>
@@ -5373,6 +4890,7 @@
         <w:rPr>
           <w:b/>
           <w:bCs/>
+          <w:lang w:val="el-GR"/>
         </w:rPr>
       </w:pPr>
     </w:p>
@@ -5381,6 +4899,7 @@
         <w:rPr>
           <w:b/>
           <w:bCs/>
+          <w:lang w:val="el-GR"/>
         </w:rPr>
       </w:pPr>
       <w:r>
@@ -5502,6 +5021,7 @@
         <w:rPr>
           <w:b/>
           <w:bCs/>
+          <w:lang w:val="el-GR"/>
         </w:rPr>
       </w:pPr>
     </w:p>
@@ -5514,7 +5034,7 @@
           <w:lang w:val="el-GR"/>
         </w:rPr>
       </w:pPr>
-      <w:bookmarkStart w:id="10" w:name="_Toc230193517"/>
+      <w:bookmarkStart w:id="6" w:name="_Toc230201362"/>
       <w:r>
         <w:rPr>
           <w:sz w:val="28"/>
@@ -5522,11 +5042,11 @@
         </w:rPr>
         <w:t>OpenMP</w:t>
       </w:r>
-      <w:bookmarkEnd w:id="10"/>
       <w:r>
         <w:rPr>
           <w:sz w:val="28"/>
           <w:szCs w:val="28"/>
+          <w:lang w:val="el-GR"/>
         </w:rPr>
         <w:t xml:space="preserve"> </w:t>
       </w:r>
@@ -5538,6 +5058,7 @@
         </w:rPr>
         <w:t>υλοποίηση</w:t>
       </w:r>
+      <w:bookmarkEnd w:id="6"/>
     </w:p>
     <w:p>
       <w:pPr>
@@ -5757,7 +5278,7 @@
           <w:lang w:val="el-GR"/>
         </w:rPr>
       </w:pPr>
-      <w:bookmarkStart w:id="11" w:name="_Toc230193518"/>
+      <w:bookmarkStart w:id="7" w:name="_Toc230201363"/>
       <w:r>
         <w:rPr>
           <w:sz w:val="28"/>
@@ -5765,11 +5286,11 @@
         </w:rPr>
         <w:t>MPI</w:t>
       </w:r>
-      <w:bookmarkEnd w:id="11"/>
       <w:r>
         <w:rPr>
           <w:sz w:val="28"/>
           <w:szCs w:val="28"/>
+          <w:lang w:val="el-GR"/>
         </w:rPr>
         <w:t xml:space="preserve"> </w:t>
       </w:r>
@@ -5781,6 +5302,7 @@
         </w:rPr>
         <w:t>υλοποίηση</w:t>
       </w:r>
+      <w:bookmarkEnd w:id="7"/>
     </w:p>
     <w:p>
       <w:pPr>
@@ -5841,7 +5363,6 @@
         <w:rPr>
           <w:lang w:val="el-GR"/>
         </w:rPr>
-        <w:lastRenderedPageBreak/>
         <w:t xml:space="preserve">• Κάθε διεργασία να υπολογίζει τοπικά </w:t>
       </w:r>
       <w:r>
@@ -6028,7 +5549,7 @@
           <w:lang w:val="el-GR"/>
         </w:rPr>
       </w:pPr>
-      <w:bookmarkStart w:id="12" w:name="_Toc230193519"/>
+      <w:bookmarkStart w:id="8" w:name="_Toc230201364"/>
       <w:r>
         <w:rPr>
           <w:sz w:val="28"/>
@@ -6036,11 +5557,11 @@
         </w:rPr>
         <w:t>CUDA</w:t>
       </w:r>
-      <w:bookmarkEnd w:id="12"/>
       <w:r>
         <w:rPr>
           <w:sz w:val="28"/>
           <w:szCs w:val="28"/>
+          <w:lang w:val="el-GR"/>
         </w:rPr>
         <w:t xml:space="preserve"> </w:t>
       </w:r>
@@ -6052,6 +5573,7 @@
         </w:rPr>
         <w:t>υλοποίηση</w:t>
       </w:r>
+      <w:bookmarkEnd w:id="8"/>
     </w:p>
     <w:p>
       <w:pPr>
@@ -6134,6 +5656,7 @@
         <w:rPr>
           <w:lang w:val="el-GR"/>
         </w:rPr>
+        <w:lastRenderedPageBreak/>
         <w:t xml:space="preserve">• Να εφαρμοστεί </w:t>
       </w:r>
       <w:r>
@@ -6269,16 +5792,21 @@
           <w:lang w:val="el-GR"/>
         </w:rPr>
       </w:pPr>
-      <w:bookmarkStart w:id="13" w:name="_Toc230193510"/>
+      <w:bookmarkStart w:id="9" w:name="_Toc230201365"/>
       <w:r>
         <w:rPr>
           <w:lang w:val="el-GR"/>
         </w:rPr>
         <w:t>7. Έλεγχος ορθότητας</w:t>
       </w:r>
-      <w:bookmarkEnd w:id="13"/>
-    </w:p>
-    <w:p>
+      <w:bookmarkEnd w:id="9"/>
+    </w:p>
+    <w:p>
+      <w:pPr>
+        <w:rPr>
+          <w:lang w:val="el-GR"/>
+        </w:rPr>
+      </w:pPr>
       <w:r>
         <w:rPr>
           <w:lang w:val="el-GR"/>
@@ -6430,7 +5958,13 @@
         <w:t>.</w:t>
       </w:r>
     </w:p>
-    <w:p/>
+    <w:p>
+      <w:pPr>
+        <w:rPr>
+          <w:lang w:val="el-GR"/>
+        </w:rPr>
+      </w:pPr>
+    </w:p>
     <w:p>
       <w:pPr>
         <w:rPr>
@@ -6440,7 +5974,6 @@
           <w:szCs w:val="24"/>
         </w:rPr>
       </w:pPr>
-      <w:bookmarkStart w:id="14" w:name="_Toc230193511"/>
       <w:r>
         <w:rPr>
           <w:b/>
@@ -6451,7 +5984,6 @@
         </w:rPr>
         <w:t>Ενδεικτικός έλεγχος</w:t>
       </w:r>
-      <w:bookmarkEnd w:id="14"/>
     </w:p>
     <w:tbl>
       <w:tblPr>
@@ -6945,14 +6477,14 @@
           <w:lang w:val="el-GR"/>
         </w:rPr>
       </w:pPr>
-      <w:bookmarkStart w:id="15" w:name="_Toc230193512"/>
+      <w:bookmarkStart w:id="10" w:name="_Toc230201366"/>
       <w:r>
         <w:rPr>
           <w:lang w:val="el-GR"/>
         </w:rPr>
         <w:t>8. Πειραματική αξιολόγηση</w:t>
       </w:r>
-      <w:bookmarkEnd w:id="15"/>
+      <w:bookmarkEnd w:id="10"/>
     </w:p>
     <w:p>
       <w:pPr>
@@ -7009,14 +6541,7 @@
         <w:rPr>
           <w:lang w:val="el-GR"/>
         </w:rPr>
-        <w:t xml:space="preserve">. Για κάθε εκτέλεση προτείνεται να καταγράφονται ξεχωριστά ο χρόνος Φάσης 1, ο </w:t>
-      </w:r>
-      <w:r>
-        <w:rPr>
-          <w:lang w:val="el-GR"/>
-        </w:rPr>
-        <w:lastRenderedPageBreak/>
-        <w:t xml:space="preserve">χρόνος Φάσης 2, το </w:t>
+        <w:t xml:space="preserve">. Για κάθε εκτέλεση προτείνεται να καταγράφονται ξεχωριστά ο χρόνος Φάσης 1, ο χρόνος Φάσης 2, το </w:t>
       </w:r>
       <w:r>
         <w:t>total</w:t>
@@ -7095,11 +6620,11 @@
       <w:pPr>
         <w:pStyle w:val="Heading2"/>
       </w:pPr>
-      <w:bookmarkStart w:id="16" w:name="_Toc230193513"/>
+      <w:bookmarkStart w:id="11" w:name="_Toc230201367"/>
       <w:r>
         <w:t>Προτεινόμενα datasets</w:t>
       </w:r>
-      <w:bookmarkEnd w:id="16"/>
+      <w:bookmarkEnd w:id="11"/>
     </w:p>
     <w:tbl>
       <w:tblPr>
@@ -7293,6 +6818,7 @@
           </w:tcPr>
           <w:p>
             <w:r>
+              <w:lastRenderedPageBreak/>
               <w:t>Large</w:t>
             </w:r>
           </w:p>
@@ -7343,11 +6869,11 @@
       <w:pPr>
         <w:pStyle w:val="Heading2"/>
       </w:pPr>
-      <w:bookmarkStart w:id="17" w:name="_Toc230193514"/>
+      <w:bookmarkStart w:id="12" w:name="_Toc230201368"/>
       <w:r>
         <w:t>Πίνακας αποτελεσμάτων προς συμπλήρωση</w:t>
       </w:r>
-      <w:bookmarkEnd w:id="17"/>
+      <w:bookmarkEnd w:id="12"/>
     </w:p>
     <w:tbl>
       <w:tblPr>
@@ -8165,14 +7691,14 @@
           <w:lang w:val="el-GR"/>
         </w:rPr>
       </w:pPr>
-      <w:bookmarkStart w:id="18" w:name="_Toc230193520"/>
+      <w:bookmarkStart w:id="13" w:name="_Toc230201369"/>
       <w:r>
         <w:rPr>
           <w:lang w:val="el-GR"/>
         </w:rPr>
         <w:t>10. Συμπεράσματα</w:t>
       </w:r>
-      <w:bookmarkEnd w:id="18"/>
+      <w:bookmarkEnd w:id="13"/>
     </w:p>
     <w:p>
       <w:pPr>
@@ -8312,7 +7838,7 @@
           <w:lang w:val="el-GR"/>
         </w:rPr>
       </w:pPr>
-      <w:bookmarkStart w:id="19" w:name="_Toc230193521"/>
+      <w:bookmarkStart w:id="14" w:name="_Toc230201370"/>
       <w:r>
         <w:rPr>
           <w:lang w:val="el-GR"/>
@@ -8320,7 +7846,7 @@
         <w:lastRenderedPageBreak/>
         <w:t>Παράρτημα Α: Ενδεικτικές εντολές εκτέλεσης</w:t>
       </w:r>
-      <w:bookmarkEnd w:id="19"/>
+      <w:bookmarkEnd w:id="14"/>
     </w:p>
     <w:p>
       <w:pPr>
@@ -8329,7 +7855,7 @@
           <w:lang w:val="el-GR"/>
         </w:rPr>
       </w:pPr>
-      <w:bookmarkStart w:id="20" w:name="_Toc230193522"/>
+      <w:bookmarkStart w:id="15" w:name="_Toc230201371"/>
       <w:r>
         <w:t>Build</w:t>
       </w:r>
@@ -8342,7 +7868,7 @@
       <w:r>
         <w:t>Makefile</w:t>
       </w:r>
-      <w:bookmarkEnd w:id="20"/>
+      <w:bookmarkEnd w:id="15"/>
     </w:p>
     <w:p>
       <w:pPr>
@@ -8356,11 +7882,11 @@
       <w:pPr>
         <w:pStyle w:val="Heading2"/>
       </w:pPr>
-      <w:bookmarkStart w:id="21" w:name="_Toc230193523"/>
+      <w:bookmarkStart w:id="16" w:name="_Toc230201372"/>
       <w:r>
         <w:t>Παραγωγή δεδομένων</w:t>
       </w:r>
-      <w:bookmarkEnd w:id="21"/>
+      <w:bookmarkEnd w:id="16"/>
     </w:p>
     <w:p>
       <w:pPr>
@@ -8368,7 +7894,6 @@
         <w:rPr>
           <w:sz w:val="18"/>
           <w:szCs w:val="18"/>
-          <w:lang w:val="el-GR"/>
         </w:rPr>
       </w:pPr>
       <w:r>
@@ -8417,6 +7942,7 @@
         <w:rPr>
           <w:sz w:val="18"/>
           <w:szCs w:val="18"/>
+          <w:lang w:val="el-GR"/>
         </w:rPr>
       </w:pPr>
       <w:r>
@@ -8424,7 +7950,7 @@
           <w:sz w:val="18"/>
           <w:szCs w:val="18"/>
         </w:rPr>
-        <w:t>make gen-data (</w:t>
+        <w:t>make</w:t>
       </w:r>
       <w:r>
         <w:rPr>
@@ -8432,14 +7958,14 @@
           <w:szCs w:val="18"/>
           <w:lang w:val="el-GR"/>
         </w:rPr>
-        <w:t>Χρήση</w:t>
+        <w:t xml:space="preserve"> </w:t>
       </w:r>
       <w:r>
         <w:rPr>
           <w:sz w:val="18"/>
           <w:szCs w:val="18"/>
         </w:rPr>
-        <w:t xml:space="preserve"> default </w:t>
+        <w:t>gen</w:t>
       </w:r>
       <w:r>
         <w:rPr>
@@ -8447,183 +7973,194 @@
           <w:szCs w:val="18"/>
           <w:lang w:val="el-GR"/>
         </w:rPr>
-        <w:t>παραμέτρων</w:t>
+        <w:t>-</w:t>
       </w:r>
       <w:r>
         <w:rPr>
           <w:sz w:val="18"/>
           <w:szCs w:val="18"/>
         </w:rPr>
-        <w:t>)</w:t>
-      </w:r>
-    </w:p>
-    <w:p>
-      <w:pPr>
-        <w:pStyle w:val="Code"/>
+        <w:t>data</w:t>
+      </w:r>
+      <w:r>
         <w:rPr>
           <w:sz w:val="18"/>
           <w:szCs w:val="18"/>
-        </w:rPr>
-      </w:pPr>
-    </w:p>
-    <w:p>
-      <w:pPr>
-        <w:pStyle w:val="Heading2"/>
-      </w:pPr>
-      <w:bookmarkStart w:id="22" w:name="_Toc230193524"/>
-      <w:r>
-        <w:rPr>
-          <w:lang w:val="el-GR"/>
-        </w:rPr>
-        <w:t>Εκτέλεση</w:t>
-      </w:r>
-      <w:r>
-        <w:t xml:space="preserve"> </w:t>
-      </w:r>
-      <w:r>
-        <w:rPr>
-          <w:lang w:val="el-GR"/>
-        </w:rPr>
-        <w:t>σειριακής</w:t>
-      </w:r>
-      <w:r>
-        <w:t xml:space="preserve"> </w:t>
-      </w:r>
-      <w:r>
-        <w:rPr>
-          <w:lang w:val="el-GR"/>
-        </w:rPr>
-        <w:t>έκδοσης</w:t>
-      </w:r>
-      <w:bookmarkEnd w:id="22"/>
-    </w:p>
-    <w:p>
-      <w:pPr>
-        <w:pStyle w:val="Code"/>
+          <w:lang w:val="el-GR"/>
+        </w:rPr>
+        <w:t xml:space="preserve"> (</w:t>
+      </w:r>
+      <w:r>
         <w:rPr>
           <w:sz w:val="18"/>
           <w:szCs w:val="18"/>
           <w:lang w:val="el-GR"/>
         </w:rPr>
-      </w:pPr>
+        <w:t>Χρήση</w:t>
+      </w:r>
       <w:r>
         <w:rPr>
           <w:sz w:val="18"/>
           <w:szCs w:val="18"/>
-        </w:rPr>
-        <w:t>make run-serial N=1000000 D=32 INPUT_DATA=data_1</w:t>
+          <w:lang w:val="el-GR"/>
+        </w:rPr>
+        <w:t xml:space="preserve"> </w:t>
       </w:r>
       <w:r>
         <w:rPr>
           <w:sz w:val="18"/>
           <w:szCs w:val="18"/>
         </w:rPr>
-        <w:t>000000</w:t>
+        <w:t>default</w:t>
       </w:r>
       <w:r>
         <w:rPr>
           <w:sz w:val="18"/>
           <w:szCs w:val="18"/>
-        </w:rPr>
-        <w:t>_32.bin</w:t>
+          <w:lang w:val="el-GR"/>
+        </w:rPr>
+        <w:t xml:space="preserve"> </w:t>
       </w:r>
       <w:r>
         <w:rPr>
           <w:sz w:val="18"/>
           <w:szCs w:val="18"/>
-        </w:rPr>
-        <w:t xml:space="preserve"> </w:t>
+          <w:lang w:val="el-GR"/>
+        </w:rPr>
+        <w:t>παραμέτρων</w:t>
       </w:r>
       <w:r>
         <w:rPr>
           <w:sz w:val="18"/>
           <w:szCs w:val="18"/>
-        </w:rPr>
-        <w:t>OUT_DATA=out_1</w:t>
-      </w:r>
-      <w:r>
+          <w:lang w:val="el-GR"/>
+        </w:rPr>
+        <w:t>)</w:t>
+      </w:r>
+    </w:p>
+    <w:p>
+      <w:pPr>
+        <w:pStyle w:val="Code"/>
         <w:rPr>
           <w:sz w:val="18"/>
           <w:szCs w:val="18"/>
-        </w:rPr>
-        <w:t>000000</w:t>
-      </w:r>
-      <w:r>
+          <w:lang w:val="el-GR"/>
+        </w:rPr>
+      </w:pPr>
+    </w:p>
+    <w:p>
+      <w:pPr>
+        <w:pStyle w:val="Heading2"/>
+        <w:rPr>
+          <w:lang w:val="el-GR"/>
+        </w:rPr>
+      </w:pPr>
+      <w:bookmarkStart w:id="17" w:name="_Toc230201373"/>
+      <w:r>
+        <w:rPr>
+          <w:lang w:val="el-GR"/>
+        </w:rPr>
+        <w:t>Εκτέλεση</w:t>
+      </w:r>
+      <w:r>
+        <w:rPr>
+          <w:lang w:val="el-GR"/>
+        </w:rPr>
+        <w:t xml:space="preserve"> </w:t>
+      </w:r>
+      <w:r>
+        <w:rPr>
+          <w:lang w:val="el-GR"/>
+        </w:rPr>
+        <w:t>σειριακής</w:t>
+      </w:r>
+      <w:r>
+        <w:rPr>
+          <w:lang w:val="el-GR"/>
+        </w:rPr>
+        <w:t xml:space="preserve"> </w:t>
+      </w:r>
+      <w:r>
+        <w:rPr>
+          <w:lang w:val="el-GR"/>
+        </w:rPr>
+        <w:t>έκδοσης</w:t>
+      </w:r>
+      <w:bookmarkEnd w:id="17"/>
+    </w:p>
+    <w:p>
+      <w:pPr>
+        <w:pStyle w:val="Code"/>
         <w:rPr>
           <w:sz w:val="18"/>
           <w:szCs w:val="18"/>
         </w:rPr>
-        <w:t>_32_standard.bin MODE=standard BLOCKS=100000</w:t>
-      </w:r>
-    </w:p>
-    <w:p>
-      <w:pPr>
-        <w:pStyle w:val="Code"/>
+      </w:pPr>
+      <w:r>
         <w:rPr>
           <w:sz w:val="18"/>
           <w:szCs w:val="18"/>
         </w:rPr>
-      </w:pPr>
+        <w:t>make run-serial N=1000000 D=32 INPUT_DATA=data_1</w:t>
+      </w:r>
       <w:r>
         <w:rPr>
           <w:sz w:val="18"/>
           <w:szCs w:val="18"/>
-          <w:lang w:val="el-GR"/>
-        </w:rPr>
-        <w:t>ή</w:t>
-      </w:r>
-    </w:p>
-    <w:p>
-      <w:pPr>
-        <w:pStyle w:val="Code"/>
+        </w:rPr>
+        <w:t>000000</w:t>
+      </w:r>
+      <w:r>
         <w:rPr>
           <w:sz w:val="18"/>
           <w:szCs w:val="18"/>
         </w:rPr>
-      </w:pPr>
+        <w:t>_32.bin</w:t>
+      </w:r>
       <w:r>
         <w:rPr>
           <w:sz w:val="18"/>
           <w:szCs w:val="18"/>
         </w:rPr>
-        <w:t xml:space="preserve">make run-serial </w:t>
+        <w:t xml:space="preserve"> </w:t>
       </w:r>
       <w:r>
         <w:rPr>
           <w:sz w:val="18"/>
           <w:szCs w:val="18"/>
         </w:rPr>
-        <w:t>(</w:t>
+        <w:t>OUT_DATA=out_1</w:t>
       </w:r>
       <w:r>
         <w:rPr>
           <w:sz w:val="18"/>
           <w:szCs w:val="18"/>
-          <w:lang w:val="el-GR"/>
-        </w:rPr>
-        <w:t>Χρήση</w:t>
+        </w:rPr>
+        <w:t>000000</w:t>
       </w:r>
       <w:r>
         <w:rPr>
           <w:sz w:val="18"/>
           <w:szCs w:val="18"/>
         </w:rPr>
-        <w:t xml:space="preserve"> default </w:t>
-      </w:r>
-      <w:r>
+        <w:t>_32_standard.bin MODE=standard BLOCKS=100000</w:t>
+      </w:r>
+    </w:p>
+    <w:p>
+      <w:pPr>
+        <w:pStyle w:val="Code"/>
         <w:rPr>
           <w:sz w:val="18"/>
           <w:szCs w:val="18"/>
-          <w:lang w:val="el-GR"/>
-        </w:rPr>
-        <w:t>παραμέτρων</w:t>
-      </w:r>
+        </w:rPr>
+      </w:pPr>
       <w:r>
         <w:rPr>
           <w:sz w:val="18"/>
           <w:szCs w:val="18"/>
-        </w:rPr>
-        <w:t>)</w:t>
+          <w:lang w:val="el-GR"/>
+        </w:rPr>
+        <w:t>ή</w:t>
       </w:r>
     </w:p>
     <w:p>
@@ -8634,260 +8171,337 @@
           <w:szCs w:val="18"/>
         </w:rPr>
       </w:pPr>
-    </w:p>
-    <w:p>
-      <w:pPr>
-        <w:pStyle w:val="Heading2"/>
-      </w:pPr>
-      <w:bookmarkStart w:id="23" w:name="_Toc230193525"/>
-      <w:r>
-        <w:t>Εκτέλεση SIMD έκδοσης</w:t>
-      </w:r>
-      <w:bookmarkEnd w:id="23"/>
-    </w:p>
-    <w:p>
-      <w:pPr>
-        <w:pStyle w:val="Code"/>
-      </w:pPr>
-      <w:r>
-        <w:t>make run-simd N=1000000 D=32 INPUT_DATA=data_</w:t>
-      </w:r>
       <w:r>
         <w:rPr>
           <w:sz w:val="18"/>
           <w:szCs w:val="18"/>
         </w:rPr>
-        <w:t>1000000</w:t>
-      </w:r>
-      <w:r>
-        <w:t>_32.bin OUT_DATA=out_</w:t>
+        <w:t>make run-serial (</w:t>
       </w:r>
       <w:r>
         <w:rPr>
           <w:sz w:val="18"/>
           <w:szCs w:val="18"/>
-        </w:rPr>
-        <w:t>1000000</w:t>
-      </w:r>
-      <w:r>
-        <w:t>_32_standard_simd.bin MODE=standard BLOCKS=100000</w:t>
-      </w:r>
-    </w:p>
-    <w:p>
-      <w:pPr>
-        <w:pStyle w:val="Code"/>
+          <w:lang w:val="el-GR"/>
+        </w:rPr>
+        <w:t>Χρήση</w:t>
+      </w:r>
+      <w:r>
         <w:rPr>
           <w:sz w:val="18"/>
           <w:szCs w:val="18"/>
         </w:rPr>
-      </w:pPr>
+        <w:t xml:space="preserve"> default </w:t>
+      </w:r>
       <w:r>
         <w:rPr>
           <w:sz w:val="18"/>
           <w:szCs w:val="18"/>
           <w:lang w:val="el-GR"/>
         </w:rPr>
-        <w:t>ή</w:t>
-      </w:r>
-    </w:p>
-    <w:p>
-      <w:pPr>
-        <w:pStyle w:val="Code"/>
+        <w:t>παραμέτρων</w:t>
+      </w:r>
+      <w:r>
         <w:rPr>
           <w:sz w:val="18"/>
           <w:szCs w:val="18"/>
         </w:rPr>
-      </w:pPr>
-      <w:r>
+        <w:t>)</w:t>
+      </w:r>
+    </w:p>
+    <w:p>
+      <w:pPr>
+        <w:pStyle w:val="Code"/>
         <w:rPr>
           <w:sz w:val="18"/>
           <w:szCs w:val="18"/>
         </w:rPr>
-        <w:t>make run-s</w:t>
+      </w:pPr>
+    </w:p>
+    <w:p>
+      <w:pPr>
+        <w:pStyle w:val="Heading2"/>
+      </w:pPr>
+      <w:bookmarkStart w:id="18" w:name="_Toc230201374"/>
+      <w:r>
+        <w:t>Εκτέλεση SIMD έκδοσης</w:t>
+      </w:r>
+      <w:bookmarkEnd w:id="18"/>
+    </w:p>
+    <w:p>
+      <w:pPr>
+        <w:pStyle w:val="Code"/>
+      </w:pPr>
+      <w:r>
+        <w:t>make run-simd N=1000000 D=32 INPUT_DATA=data_</w:t>
       </w:r>
       <w:r>
         <w:rPr>
           <w:sz w:val="18"/>
           <w:szCs w:val="18"/>
         </w:rPr>
-        <w:t>imd</w:t>
+        <w:t>1000000</w:t>
+      </w:r>
+      <w:r>
+        <w:t>_32.bin OUT_DATA=out_</w:t>
       </w:r>
       <w:r>
         <w:rPr>
           <w:sz w:val="18"/>
           <w:szCs w:val="18"/>
         </w:rPr>
-        <w:t xml:space="preserve"> (</w:t>
-      </w:r>
-      <w:r>
+        <w:t>1000000</w:t>
+      </w:r>
+      <w:r>
+        <w:t>_32_standard_simd.bin MODE=standard BLOCKS=100000</w:t>
+      </w:r>
+    </w:p>
+    <w:p>
+      <w:pPr>
+        <w:pStyle w:val="Code"/>
         <w:rPr>
           <w:sz w:val="18"/>
           <w:szCs w:val="18"/>
-          <w:lang w:val="el-GR"/>
-        </w:rPr>
-        <w:t>Χρήση</w:t>
-      </w:r>
+        </w:rPr>
+      </w:pPr>
       <w:r>
         <w:rPr>
           <w:sz w:val="18"/>
           <w:szCs w:val="18"/>
-        </w:rPr>
-        <w:t xml:space="preserve"> default </w:t>
-      </w:r>
-      <w:r>
+          <w:lang w:val="el-GR"/>
+        </w:rPr>
+        <w:t>ή</w:t>
+      </w:r>
+    </w:p>
+    <w:p>
+      <w:pPr>
+        <w:pStyle w:val="Code"/>
         <w:rPr>
           <w:sz w:val="18"/>
           <w:szCs w:val="18"/>
-          <w:lang w:val="el-GR"/>
-        </w:rPr>
-        <w:t>παραμέτρων</w:t>
-      </w:r>
+        </w:rPr>
+      </w:pPr>
       <w:r>
         <w:rPr>
           <w:sz w:val="18"/>
           <w:szCs w:val="18"/>
         </w:rPr>
-        <w:t>)</w:t>
-      </w:r>
-    </w:p>
-    <w:p>
-      <w:pPr>
-        <w:pStyle w:val="Code"/>
+        <w:t>make run-s</w:t>
+      </w:r>
+      <w:r>
         <w:rPr>
           <w:sz w:val="18"/>
           <w:szCs w:val="18"/>
         </w:rPr>
-      </w:pPr>
-    </w:p>
-    <w:p>
-      <w:pPr>
-        <w:pStyle w:val="Heading2"/>
-      </w:pPr>
-      <w:bookmarkStart w:id="24" w:name="_Toc230193526"/>
-      <w:r>
-        <w:t>Έλεγχος ορθότητας</w:t>
-      </w:r>
-      <w:bookmarkEnd w:id="24"/>
-    </w:p>
-    <w:p>
-      <w:pPr>
-        <w:pStyle w:val="Code"/>
-      </w:pPr>
-      <w:r>
-        <w:t>make verify N=1000000 D=32 INPUT_DATA=data_</w:t>
+        <w:t>imd</w:t>
       </w:r>
       <w:r>
         <w:rPr>
           <w:sz w:val="18"/>
           <w:szCs w:val="18"/>
         </w:rPr>
-        <w:t>1000000</w:t>
-      </w:r>
-      <w:r>
-        <w:t>_32.bin OUT_DATA=out_1</w:t>
+        <w:t xml:space="preserve"> (</w:t>
       </w:r>
       <w:r>
         <w:rPr>
           <w:sz w:val="18"/>
           <w:szCs w:val="18"/>
-        </w:rPr>
-        <w:t>1000000</w:t>
-      </w:r>
-      <w:r>
-        <w:t>_32_standard.bin MODE=standard DTYPE=float64</w:t>
-      </w:r>
-    </w:p>
-    <w:p>
-      <w:pPr>
-        <w:pStyle w:val="Code"/>
+          <w:lang w:val="el-GR"/>
+        </w:rPr>
+        <w:t>Χρήση</w:t>
+      </w:r>
+      <w:r>
         <w:rPr>
           <w:sz w:val="18"/>
           <w:szCs w:val="18"/>
         </w:rPr>
-      </w:pPr>
+        <w:t xml:space="preserve"> default </w:t>
+      </w:r>
       <w:r>
         <w:rPr>
           <w:sz w:val="18"/>
           <w:szCs w:val="18"/>
           <w:lang w:val="el-GR"/>
         </w:rPr>
-        <w:t>ή</w:t>
-      </w:r>
-    </w:p>
-    <w:p>
-      <w:pPr>
-        <w:pStyle w:val="Code"/>
+        <w:t>παραμέτρων</w:t>
+      </w:r>
+      <w:r>
         <w:rPr>
           <w:sz w:val="18"/>
           <w:szCs w:val="18"/>
         </w:rPr>
-      </w:pPr>
-      <w:r>
+        <w:t>)</w:t>
+      </w:r>
+    </w:p>
+    <w:p>
+      <w:pPr>
+        <w:pStyle w:val="Code"/>
         <w:rPr>
           <w:sz w:val="18"/>
           <w:szCs w:val="18"/>
         </w:rPr>
-        <w:t xml:space="preserve">make </w:t>
+      </w:pPr>
+    </w:p>
+    <w:p>
+      <w:pPr>
+        <w:pStyle w:val="Heading2"/>
+      </w:pPr>
+      <w:bookmarkStart w:id="19" w:name="_Toc230201375"/>
+      <w:r>
+        <w:t>Έλεγχος ορθότητας</w:t>
+      </w:r>
+      <w:bookmarkEnd w:id="19"/>
+    </w:p>
+    <w:p>
+      <w:pPr>
+        <w:pStyle w:val="Code"/>
+      </w:pPr>
+      <w:r>
+        <w:t>make verify N=1000000 D=32 INPUT_DATA=data_</w:t>
       </w:r>
       <w:r>
         <w:rPr>
           <w:sz w:val="18"/>
           <w:szCs w:val="18"/>
         </w:rPr>
-        <w:t>verify</w:t>
+        <w:t>1000000</w:t>
+      </w:r>
+      <w:r>
+        <w:t>_32.bin OUT_DATA=out_1</w:t>
       </w:r>
       <w:r>
         <w:rPr>
           <w:sz w:val="18"/>
           <w:szCs w:val="18"/>
         </w:rPr>
-        <w:t xml:space="preserve"> (</w:t>
-      </w:r>
-      <w:r>
+        <w:t>1000000</w:t>
+      </w:r>
+      <w:r>
+        <w:t>_32_standard.bin MODE=standard DTYPE=float64</w:t>
+      </w:r>
+    </w:p>
+    <w:p>
+      <w:pPr>
+        <w:pStyle w:val="Code"/>
         <w:rPr>
           <w:sz w:val="18"/>
           <w:szCs w:val="18"/>
           <w:lang w:val="el-GR"/>
         </w:rPr>
-        <w:t>Χρήση</w:t>
-      </w:r>
+      </w:pPr>
       <w:r>
         <w:rPr>
           <w:sz w:val="18"/>
           <w:szCs w:val="18"/>
-        </w:rPr>
-        <w:t xml:space="preserve"> default </w:t>
-      </w:r>
-      <w:r>
+          <w:lang w:val="el-GR"/>
+        </w:rPr>
+        <w:t>ή</w:t>
+      </w:r>
+    </w:p>
+    <w:p>
+      <w:pPr>
+        <w:pStyle w:val="Code"/>
         <w:rPr>
           <w:sz w:val="18"/>
           <w:szCs w:val="18"/>
           <w:lang w:val="el-GR"/>
         </w:rPr>
-        <w:t>παραμέτρων</w:t>
-      </w:r>
+      </w:pPr>
       <w:r>
         <w:rPr>
           <w:sz w:val="18"/>
           <w:szCs w:val="18"/>
         </w:rPr>
+        <w:t>make</w:t>
+      </w:r>
+      <w:r>
+        <w:rPr>
+          <w:sz w:val="18"/>
+          <w:szCs w:val="18"/>
+          <w:lang w:val="el-GR"/>
+        </w:rPr>
+        <w:t xml:space="preserve"> </w:t>
+      </w:r>
+      <w:r>
+        <w:rPr>
+          <w:sz w:val="18"/>
+          <w:szCs w:val="18"/>
+        </w:rPr>
+        <w:t>verify</w:t>
+      </w:r>
+      <w:r>
+        <w:rPr>
+          <w:sz w:val="18"/>
+          <w:szCs w:val="18"/>
+          <w:lang w:val="el-GR"/>
+        </w:rPr>
+        <w:t xml:space="preserve"> (</w:t>
+      </w:r>
+      <w:r>
+        <w:rPr>
+          <w:sz w:val="18"/>
+          <w:szCs w:val="18"/>
+          <w:lang w:val="el-GR"/>
+        </w:rPr>
+        <w:t>Χρήση</w:t>
+      </w:r>
+      <w:r>
+        <w:rPr>
+          <w:sz w:val="18"/>
+          <w:szCs w:val="18"/>
+          <w:lang w:val="el-GR"/>
+        </w:rPr>
+        <w:t xml:space="preserve"> </w:t>
+      </w:r>
+      <w:r>
+        <w:rPr>
+          <w:sz w:val="18"/>
+          <w:szCs w:val="18"/>
+        </w:rPr>
+        <w:t>default</w:t>
+      </w:r>
+      <w:r>
+        <w:rPr>
+          <w:sz w:val="18"/>
+          <w:szCs w:val="18"/>
+          <w:lang w:val="el-GR"/>
+        </w:rPr>
+        <w:t xml:space="preserve"> </w:t>
+      </w:r>
+      <w:r>
+        <w:rPr>
+          <w:sz w:val="18"/>
+          <w:szCs w:val="18"/>
+          <w:lang w:val="el-GR"/>
+        </w:rPr>
+        <w:t>παραμέτρων</w:t>
+      </w:r>
+      <w:r>
+        <w:rPr>
+          <w:sz w:val="18"/>
+          <w:szCs w:val="18"/>
+          <w:lang w:val="el-GR"/>
+        </w:rPr>
         <w:t>)</w:t>
       </w:r>
     </w:p>
     <w:p>
       <w:pPr>
         <w:pStyle w:val="Code"/>
+        <w:rPr>
+          <w:lang w:val="el-GR"/>
+        </w:rPr>
       </w:pPr>
     </w:p>
     <w:p>
       <w:pPr>
         <w:pStyle w:val="Heading2"/>
       </w:pPr>
-      <w:bookmarkStart w:id="25" w:name="_Toc230193527"/>
+      <w:bookmarkStart w:id="20" w:name="_Toc230201376"/>
       <w:r>
         <w:t>Άμεση μεταγλώττιση χωρίς Makefile</w:t>
       </w:r>
-      <w:bookmarkEnd w:id="25"/>
+      <w:bookmarkEnd w:id="20"/>
     </w:p>
     <w:p>
       <w:pPr>
@@ -8917,13 +8531,7 @@
         <w:t>g++ -std=c++17 -O3 -Wall -mavx2 -mfma -march=native -pthread -o scaler_simd Scaler_SIMD.cpp</w:t>
       </w:r>
     </w:p>
-    <w:p>
-      <w:pPr>
-        <w:rPr>
-          <w:lang w:val="el-GR"/>
-        </w:rPr>
-      </w:pPr>
-    </w:p>
+    <w:p/>
     <w:sectPr>
       <w:pgSz w:w="11906" w:h="16838"/>
       <w:pgMar w:top="1440" w:right="1440" w:bottom="1440" w:left="1440" w:header="708" w:footer="708" w:gutter="0"/>
@@ -9541,6 +9149,7 @@
   <w:style w:type="character" w:default="1" w:styleId="DefaultParagraphFont">
     <w:name w:val="Default Paragraph Font"/>
     <w:uiPriority w:val="1"/>
+    <w:semiHidden/>
     <w:unhideWhenUsed/>
   </w:style>
   <w:style w:type="table" w:default="1" w:styleId="TableNormal">

</xml_diff>